<commit_message>
docs: the 10-pager and design docs rewritten for the rebuilt game
- 10-pager (cover + 9 pages, rendered through Word):
  - Outline and Character tell The Kettle-Charm (Nell, Tam, Veil, and the
    Matriarch who was Ysolde).
  - Gameplay and Enemies give the new guardians: their real attack sets,
    telegraphs, phases, and health sized to the party.
  - Mechanics describes the physics benches; Game world the five drawn regions
    and their ground.
  - Fixes: "call the next wave" (the button is gone), the old diary "sketch",
    and the third star, which is for a Great flask, not for the guardian.
  - Every image is the game's own: harness screenshots and the procedural sprites
    exported as baked.
- DESIGN.md section 12 (the departments, benches, guardians, arenas and the
  story's rules) and ART_BRIEF.md (the procedural art and its rules).
- PixelCanvas.ExportDir: the harness writes every procedural sprite to PNG as it
  is baked, the only way to get their exact pixels out.
</commit_message>
<xml_diff>
--- a/docs/Alchemists_Arsenal_10-pager.docx
+++ b/docs/Alchemists_Arsenal_10-pager.docx
@@ -82,9 +82,9 @@
       <w:r>
         <w:drawing>
           <wp:inline distT="0" distB="0" distL="0" distR="0">
-            <wp:extent cx="5619750" cy="3514725"/>
+            <wp:extent cx="5619750" cy="3162300"/>
             <wp:effectExtent t="0" r="0" b="0" l="0"/>
-            <wp:docPr id="1" name="cover.png" descr="Cover art: the heroes and the forest's creatures either side of the bubbling cauldron, the Coven Matriarch looming behind." title="Cover art: the heroes and the forest's creatures either side of the bubbling cauldron, the Coven Matriarch looming behind."/>
+            <wp:docPr id="1" name="cover.png" descr="Cover art: the shop on the night the charm went crooked: the witch, the glowing kettle and Tam asleep at the table." title="Cover art: the shop on the night the charm went crooked: the witch, the glowing kettle and Tam asleep at the table."/>
             <wp:cNvGraphicFramePr>
               <a:graphicFrameLocks xmlns:a="http://schemas.openxmlformats.org/drawingml/2006/main" noChangeAspect="1"/>
             </wp:cNvGraphicFramePr>
@@ -107,7 +107,7 @@
                   <pic:spPr bwMode="auto">
                     <a:xfrm>
                       <a:off x="0" y="0"/>
-                      <a:ext cx="5619750" cy="3514725"/>
+                      <a:ext cx="5619750" cy="3162300"/>
                     </a:xfrm>
                     <a:prstGeom prst="rect">
                       <a:avLst/>
@@ -516,7 +516,7 @@
           <w:sz w:val="19"/>
           <w:szCs w:val="19"/>
         </w:rPr>
-        <w:t xml:space="preserve">Version 1.0  ·  22 September 2026</w:t>
+        <w:t xml:space="preserve">Version 2.0  ·  22 September 2026</w:t>
       </w:r>
     </w:p>
     <w:p>
@@ -546,7 +546,37 @@
         <w:jc w:val="both"/>
       </w:pPr>
       <w:r>
-        <w:t xml:space="preserve">It was a small spell — a kettle-charm, the kind her grandmother could cast half-asleep. But the witch was not half-asleep. She was angry, and quick, and the words came out crooked. Now someone she loves has fallen into a sleep they will not wake from, and the one thing that can undo it lies deep in the cursed forest beyond her door: a forest full of elemental monsters she cannot face herself.</w:t>
+        <w:t xml:space="preserve">The night before Tam leaves for the Coven’s school on the Peak, Tam and their older sister </w:t>
+      </w:r>
+      <w:r>
+        <w:rPr>
+          <w:b/>
+          <w:bCs/>
+        </w:rPr>
+        <w:t xml:space="preserve">Nell Ashgrove</w:t>
+      </w:r>
+      <w:r>
+        <w:t xml:space="preserve"> fight. Nell reaches for the little kettle-charm her grandmother taught her, the one that calms a room, and says it crooked because she is angry. Tam lays their head on the table and does not wake. At dawn </w:t>
+      </w:r>
+      <w:r>
+        <w:rPr>
+          <w:b/>
+          <w:bCs/>
+        </w:rPr>
+        <w:t xml:space="preserve">Sister Veil</w:t>
+      </w:r>
+      <w:r>
+        <w:t xml:space="preserve">, the Coven’s envoy, is at the door: a sleep-curse, she says, that only the Coven’s </w:t>
+      </w:r>
+      <w:r>
+        <w:rPr>
+          <w:b/>
+          <w:bCs/>
+        </w:rPr>
+        <w:t xml:space="preserve">Matriarch</w:t>
+      </w:r>
+      <w:r>
+        <w:t xml:space="preserve"> can lift, with a cure whose ingredients lie along five roads.</w:t>
       </w:r>
     </w:p>
     <w:p>
@@ -555,7 +585,7 @@
         <w:jc w:val="both"/>
       </w:pPr>
       <w:r>
-        <w:t xml:space="preserve">So she does the one thing she can. She opens a potion shop on the forest’s edge and arms the adventurers who can walk the road for her. Every flask she brews becomes a bomb in somebody else’s hands. The forest is split into five elemental regions — the </w:t>
+        <w:t xml:space="preserve">So Nell does the one thing she can. She opens her potion shop at the forest’s edge and arms the heroes who will walk the road for her, and every flask she brews becomes a bomb in somebody else’s hands. Each region pushed back — the </w:t>
       </w:r>
       <w:r>
         <w:rPr>
@@ -595,7 +625,7 @@
         <w:t xml:space="preserve">Venom Swamp</w:t>
       </w:r>
       <w:r>
-        <w:t xml:space="preserve"> and, at the summit, </w:t>
+        <w:t xml:space="preserve"> and </w:t>
       </w:r>
       <w:r>
         <w:rPr>
@@ -605,7 +635,7 @@
         <w:t xml:space="preserve">the Coven’s Peak</w:t>
       </w:r>
       <w:r>
-        <w:t xml:space="preserve"> — and every region pushed back brings her a step closer to the cure, and fills in another line of the sketch in her diary of the thing waiting at the centre.</w:t>
+        <w:t xml:space="preserve"> — brings home a clue: the trees whisper her grandmother’s name, a scorched page describes a ward “for when they come for the child”, children sleep in the ice with Coven thread round their wrists.</w:t>
       </w:r>
     </w:p>
     <w:p>
@@ -614,17 +644,27 @@
         <w:jc w:val="both"/>
       </w:pPr>
       <w:r>
-        <w:t xml:space="preserve">Not every customer is what they seem. An envoy of the Coven starts calling at the counter — </w:t>
+        <w:t xml:space="preserve">At the summit the Matriarch’s mask breaks, and under it is </w:t>
+      </w:r>
+      <w:r>
+        <w:rPr>
+          <w:b/>
+          <w:bCs/>
+        </w:rPr>
+        <w:t xml:space="preserve">Grandmother Ysolde</w:t>
+      </w:r>
+      <w:r>
+        <w:t xml:space="preserve">, who went up the mountain to stop the Coven taking children and was made into their Mother instead. Nell’s crooked words were never a curse: they set off the ward Ysolde hid in the kettle, which put Tam to sleep where the Coven could not reach them — and the “cure” is the key that breaks it. </w:t>
       </w:r>
       <w:r>
         <w:rPr>
           <w:i/>
           <w:iCs/>
         </w:rPr>
-        <w:t xml:space="preserve">“The Coven noticed your shop. That is not, in itself, good news.”</w:t>
-      </w:r>
-      <w:r>
-        <w:t xml:space="preserve"> Breaking the curse at the Coven’s Peak finally wakes her loved one, and reveals the truth she never suspected: the curse was a trap all along, set by someone far bigger than a village witch.</w:t>
+        <w:t xml:space="preserve">“You didn’t break my charm, Nell. You finished it.”</w:t>
+      </w:r>
+      <w:r>
+        <w:t xml:space="preserve"> The ward lifts only when the one who spoke it lets the anger go. Nell pours the cure into the fire, Tam wakes, and when Veil comes back for the child she finds every hero Nell ever armed standing in the doorway.</w:t>
       </w:r>
     </w:p>
     <w:p>
@@ -940,7 +980,7 @@
                 <w:sz w:val="17"/>
                 <w:szCs w:val="17"/>
               </w:rPr>
-              <w:t xml:space="preserve">The heroes carry those exact flasks into one of five elemental regions and fight waves of monsters on their own, choosing for themselves what to throw at whom. The player watches, and can speed up, pause or call the next wave.</w:t>
+              <w:t xml:space="preserve">The heroes carry those exact flasks into one of five elemental regions and fight waves of monsters, and each region’s guardian, on their own, choosing for themselves what to throw at whom. The player watches, and can speed up or pause.</w:t>
             </w:r>
           </w:p>
         </w:tc>
@@ -1035,7 +1075,7 @@
                 <w:sz w:val="17"/>
                 <w:szCs w:val="17"/>
               </w:rPr>
-              <w:t xml:space="preserve">Read the report and the pay, buy upgrades, hire and level heroes, pick tomorrow’s party and road, and turn a new page of the diary. Sleeping saves the game.</w:t>
+              <w:t xml:space="preserve">Read the report and the pay, buy upgrades, hire and level heroes, pick tomorrow’s party and road, and watch whatever part of the story the day earned. Sleeping saves the game.</w:t>
             </w:r>
           </w:p>
         </w:tc>
@@ -1433,7 +1473,7 @@
                 <w:b/>
                 <w:bCs/>
               </w:rPr>
-              <w:t xml:space="preserve">Main character: “the Witch”</w:t>
+              <w:t xml:space="preserve">Main character: Nell Ashgrove</w:t>
             </w:r>
           </w:p>
           <w:p>
@@ -1452,14 +1492,7 @@
               <w:t xml:space="preserve">is</w:t>
             </w:r>
             <w:r>
-              <w:t xml:space="preserve"> her, working the counter, the bench and the cauldron. We come to know her through her diary, written in the first person — guilty, stubborn and determined to put right what she broke. </w:t>
-            </w:r>
-            <w:r>
-              <w:rPr>
-                <w:i/>
-                <w:iCs/>
-              </w:rPr>
-              <w:t xml:space="preserve">“If I can do it once I can do it five times.”</w:t>
+              <w:t xml:space="preserve"> her, working the counter, the bench and the cauldron. We come to know her through her diary, written in the first person — guilty, stubborn and determined to put right what she thinks she broke.</w:t>
             </w:r>
           </w:p>
           <w:p>
@@ -1472,10 +1505,10 @@
                 <w:b/>
                 <w:bCs/>
               </w:rPr>
-              <w:t xml:space="preserve">The one who sleeps.</w:t>
-            </w:r>
-            <w:r>
-              <w:t xml:space="preserve"> Never named and never seen awake — the diary only ever calls them “they”. Their silence is the reason for everything; waking them is the goal of the whole game.</w:t>
+              <w:t xml:space="preserve">Tam</w:t>
+            </w:r>
+            <w:r>
+              <w:t xml:space="preserve">, her younger sibling, wanted to go somewhere she couldn’t follow. Asleep at the table from the first night, Tam is the reason for everything; waking them is the goal of the whole game.</w:t>
             </w:r>
           </w:p>
         </w:tc>
@@ -1492,15 +1525,15 @@
           </w:tcPr>
           <w:p>
             <w:pPr>
-              <w:spacing w:after="60" w:before="150"/>
+              <w:spacing w:after="60" w:before="60"/>
               <w:jc w:val="center"/>
             </w:pPr>
             <w:r>
               <w:drawing>
                 <wp:inline distT="0" distB="0" distL="0" distR="0">
-                  <wp:extent cx="1123950" cy="1123950"/>
+                  <wp:extent cx="914400" cy="1466850"/>
                   <wp:effectExtent t="0" r="0" b="0" l="0"/>
-                  <wp:docPr id="1" name="logo.png" descr="The witch's hat, her emblem" title="The witch's hat, her emblem"/>
+                  <wp:docPr id="1" name="cast_nell.png" descr="Nell Ashgrove" title="Nell Ashgrove"/>
                   <wp:cNvGraphicFramePr>
                     <a:graphicFrameLocks xmlns:a="http://schemas.openxmlformats.org/drawingml/2006/main" noChangeAspect="1"/>
                   </wp:cNvGraphicFramePr>
@@ -1523,7 +1556,7 @@
                         <pic:spPr bwMode="auto">
                           <a:xfrm>
                             <a:off x="0" y="0"/>
-                            <a:ext cx="1123950" cy="1123950"/>
+                            <a:ext cx="914400" cy="1466850"/>
                           </a:xfrm>
                           <a:prstGeom prst="rect">
                             <a:avLst/>
@@ -1549,7 +1582,7 @@
                 <w:sz w:val="15"/>
                 <w:szCs w:val="15"/>
               </w:rPr>
-              <w:t xml:space="preserve">The witch’s hat — the game’s emblem</w:t>
+              <w:t xml:space="preserve">Nell Ashgrove</w:t>
             </w:r>
           </w:p>
         </w:tc>
@@ -1595,15 +1628,15 @@
           </w:tcPr>
           <w:p>
             <w:pPr>
-              <w:spacing w:after="60" w:before="40"/>
+              <w:spacing w:after="60" w:before="20"/>
               <w:jc w:val="center"/>
             </w:pPr>
             <w:r>
               <w:drawing>
                 <wp:inline distT="0" distB="0" distL="0" distR="0">
-                  <wp:extent cx="1257300" cy="1257300"/>
+                  <wp:extent cx="1428750" cy="1362075"/>
                   <wp:effectExtent t="0" r="0" b="0" l="0"/>
-                  <wp:docPr id="1" name="boss.png" descr="The Coven Matriarch" title="The Coven Matriarch"/>
+                  <wp:docPr id="1" name="boss_matriarch.png" descr="The Coven Matriarch" title="The Coven Matriarch"/>
                   <wp:cNvGraphicFramePr>
                     <a:graphicFrameLocks xmlns:a="http://schemas.openxmlformats.org/drawingml/2006/main" noChangeAspect="1"/>
                   </wp:cNvGraphicFramePr>
@@ -1626,7 +1659,7 @@
                         <pic:spPr bwMode="auto">
                           <a:xfrm>
                             <a:off x="0" y="0"/>
-                            <a:ext cx="1257300" cy="1257300"/>
+                            <a:ext cx="1428750" cy="1362075"/>
                           </a:xfrm>
                           <a:prstGeom prst="rect">
                             <a:avLst/>
@@ -1676,7 +1709,30 @@
                 <w:b/>
                 <w:bCs/>
               </w:rPr>
-              <w:t xml:space="preserve">Main antagonist: “the Coven Matriarch”</w:t>
+              <w:t xml:space="preserve">Antagonists: Sister Veil and the Coven Matriarch</w:t>
+            </w:r>
+          </w:p>
+          <w:p>
+            <w:pPr>
+              <w:spacing w:after="110" w:before="0" w:line="264"/>
+              <w:jc w:val="both"/>
+            </w:pPr>
+            <w:r>
+              <w:rPr>
+                <w:b/>
+                <w:bCs/>
+              </w:rPr>
+              <w:t xml:space="preserve">Sister Veil</w:t>
+            </w:r>
+            <w:r>
+              <w:t xml:space="preserve"> calls at the counter from the first days, a customer like any other, and it is she who sends Nell after the cure. Her lines sharpen as Nell gets closer: </w:t>
+            </w:r>
+            <w:r>
+              <w:rPr>
+                <w:i/>
+                <w:iCs/>
+              </w:rPr>
+              <w:t xml:space="preserve">“You’re asking questions about your grandmother. Don’t. Ask about the cure.”</w:t>
             </w:r>
           </w:p>
           <w:p>
@@ -1685,7 +1741,27 @@
               <w:jc w:val="both"/>
             </w:pPr>
             <w:r>
-              <w:t xml:space="preserve">Waiting at the summit of the Coven’s Peak, the Matriarch guards the final region and the last piece of the cure. She is the “thing at the centre” whose portrait the witch assembles in her diary, one arm at a time, as each region falls. Her Coven has its eye on the shop from the very first days, through its envoy at the counter — and when she finally falls, it becomes clear that she was only ever the door to something bigger.</w:t>
+              <w:t xml:space="preserve">The </w:t>
+            </w:r>
+            <w:r>
+              <w:rPr>
+                <w:b/>
+                <w:bCs/>
+              </w:rPr>
+              <w:t xml:space="preserve">Matriarch</w:t>
+            </w:r>
+            <w:r>
+              <w:t xml:space="preserve"> waits at the summit: six arms, a crown of spires, a ring of eyes and a cracked porcelain mask. Under the mask is </w:t>
+            </w:r>
+            <w:r>
+              <w:rPr>
+                <w:b/>
+                <w:bCs/>
+              </w:rPr>
+              <w:t xml:space="preserve">Grandmother Ysolde</w:t>
+            </w:r>
+            <w:r>
+              <w:t xml:space="preserve">, the Coven’s prisoner and its weapon. The real enemy is the Coven itself, which is bigger than one Matriarch.</w:t>
             </w:r>
           </w:p>
         </w:tc>
@@ -2859,7 +2935,7 @@
                 <w:sz w:val="16"/>
                 <w:szCs w:val="16"/>
               </w:rPr>
-              <w:t xml:space="preserve">Bark Treants, quick Thornlings and a Water-aligned wave of Mossbacks; the Elder Woodwose guards the end. The teaching road — day one has no boss.</w:t>
+              <w:t xml:space="preserve">Bark Treants, quick Thornlings and a Water-aligned wave of Mossbacks. The teaching road: the Elder Woodwose waits at its end once the road has been cleared.</w:t>
             </w:r>
           </w:p>
         </w:tc>
@@ -3311,7 +3387,7 @@
                 <w:sz w:val="16"/>
                 <w:szCs w:val="16"/>
               </w:rPr>
-              <w:t xml:space="preserve">Coven Acolytes, Warded Effigies and the Coven Matriarch herself.</w:t>
+              <w:t xml:space="preserve">Coven Acolytes, Warded Effigies and the Coven Matriarch herself: the end of the story.</w:t>
             </w:r>
           </w:p>
         </w:tc>
@@ -3498,7 +3574,7 @@
         <w:t xml:space="preserve">The shop</w:t>
       </w:r>
       <w:r>
-        <w:t xml:space="preserve"> is warm: candle-gold light on dark wood and ink, a cauldron bubbling in the middle of the room, a bell over the counter and jars of herbs along the bench. </w:t>
+        <w:t xml:space="preserve"> is warm: candlelight flickering on shelves of stoppered jars, herbs hung up to dry and swinging in the draught, a cauldron bubbling in the middle of the room. </w:t>
       </w:r>
       <w:r>
         <w:rPr>
@@ -3508,7 +3584,7 @@
         <w:t xml:space="preserve">The forest</w:t>
       </w:r>
       <w:r>
-        <w:t xml:space="preserve"> beyond the door is cold and elemental, and every region wears its element in its palette, its ground and its monsters. The mood is cosy on the surface and uneasy underneath — the shop is a safe, busy place; the forest is where things go wrong.</w:t>
+        <w:t xml:space="preserve"> beyond the door is cold and elemental, and every region is drawn as a place of its own — its floor, its skyline and the air over it — with ground that matters: heroes slide on the Frostbite ice and wade slowly through the Venom Swamp’s bog pools. The mood is cosy on the surface and uneasy underneath.</w:t>
       </w:r>
     </w:p>
     <w:p>
@@ -3566,7 +3642,7 @@
             <w:r>
               <w:drawing>
                 <wp:inline distT="0" distB="0" distL="0" distR="0">
-                  <wp:extent cx="3200400" cy="1752600"/>
+                  <wp:extent cx="3200400" cy="1638300"/>
                   <wp:effectExtent t="0" r="0" b="0" l="0"/>
                   <wp:docPr id="1" name="world_shop.png" descr="The cauldron mid-brew with herbs floating in it" title="The cauldron mid-brew with herbs floating in it"/>
                   <wp:cNvGraphicFramePr>
@@ -3591,7 +3667,7 @@
                         <pic:spPr bwMode="auto">
                           <a:xfrm>
                             <a:off x="0" y="0"/>
-                            <a:ext cx="3200400" cy="1752600"/>
+                            <a:ext cx="3200400" cy="1638300"/>
                           </a:xfrm>
                           <a:prstGeom prst="rect">
                             <a:avLst/>
@@ -3845,7 +3921,7 @@
               <w:t xml:space="preserve">Whispering Woods</w:t>
             </w:r>
             <w:r>
-              <w:t xml:space="preserve"> — mossy clearings and talking trees.</w:t>
+              <w:t xml:space="preserve"> — a mossy clearing under a dark tree line, leaves falling.</w:t>
             </w:r>
           </w:p>
           <w:p>
@@ -3866,7 +3942,7 @@
               <w:t xml:space="preserve">Cinder Peaks</w:t>
             </w:r>
             <w:r>
-              <w:t xml:space="preserve"> — scorched ridges and ash.</w:t>
+              <w:t xml:space="preserve"> — basalt split by glowing lava, volcanoes on a red sky, embers rising.</w:t>
             </w:r>
           </w:p>
           <w:p>
@@ -3887,7 +3963,7 @@
               <w:t xml:space="preserve">Frostbite Caverns</w:t>
             </w:r>
             <w:r>
-              <w:t xml:space="preserve"> — blue ice underground.</w:t>
+              <w:t xml:space="preserve"> — an ice floor under hanging icicles, snow drifting. Everyone slides.</w:t>
             </w:r>
           </w:p>
           <w:p>
@@ -3908,7 +3984,7 @@
               <w:t xml:space="preserve">Venom Swamp</w:t>
             </w:r>
             <w:r>
-              <w:t xml:space="preserve"> — poisoned, sucking bog.</w:t>
+              <w:t xml:space="preserve"> — mud, reeds and toxic pools that drag at anyone who wades in.</w:t>
             </w:r>
           </w:p>
           <w:p>
@@ -3929,7 +4005,7 @@
               <w:t xml:space="preserve">The Coven’s Peak</w:t>
             </w:r>
             <w:r>
-              <w:t xml:space="preserve"> — the violet summit where the Coven waits.</w:t>
+              <w:t xml:space="preserve"> — flagstones round a rune circle at the foot of the spire.</w:t>
             </w:r>
           </w:p>
         </w:tc>
@@ -3952,9 +4028,9 @@
             <w:r>
               <w:drawing>
                 <wp:inline distT="0" distB="0" distL="0" distR="0">
-                  <wp:extent cx="3200400" cy="1828800"/>
+                  <wp:extent cx="3200400" cy="2124075"/>
                   <wp:effectExtent t="0" r="0" b="0" l="0"/>
-                  <wp:docPr id="1" name="world_forest.png" descr="The party fighting the Whispering Woods' guardian" title="The party fighting the Whispering Woods' guardian"/>
+                  <wp:docPr id="1" name="world_forest.png" descr="The party against the enraged Woodwose, its Thorn Volley marked on the ground" title="The party against the enraged Woodwose, its Thorn Volley marked on the ground"/>
                   <wp:cNvGraphicFramePr>
                     <a:graphicFrameLocks xmlns:a="http://schemas.openxmlformats.org/drawingml/2006/main" noChangeAspect="1"/>
                   </wp:cNvGraphicFramePr>
@@ -3977,7 +4053,7 @@
                         <pic:spPr bwMode="auto">
                           <a:xfrm>
                             <a:off x="0" y="0"/>
-                            <a:ext cx="3200400" cy="1828800"/>
+                            <a:ext cx="3200400" cy="2124075"/>
                           </a:xfrm>
                           <a:prstGeom prst="rect">
                             <a:avLst/>
@@ -4003,7 +4079,7 @@
                 <w:sz w:val="15"/>
                 <w:szCs w:val="15"/>
               </w:rPr>
-              <w:t xml:space="preserve">The full party against the Woods’ guardian.</w:t>
+              <w:t xml:space="preserve">The enraged Woodwose; its Thorn Volley’s landing spots marked on the ground.</w:t>
             </w:r>
           </w:p>
         </w:tc>
@@ -4112,10 +4188,10 @@
           <w:b/>
           <w:bCs/>
         </w:rPr>
-        <w:t xml:space="preserve">Guilt turning into resolve.</w:t>
-      </w:r>
-      <w:r>
-        <w:t xml:space="preserve"> The story is told almost without walls of text — through the diary’s illustrations, animated page turns, words that type themselves onto the page, and a sketch of the enemy that assembles itself one piece for every region cleared. The tone is warm and a little melancholy, never grim.</w:t>
+        <w:t xml:space="preserve">Guilt turning into resolve — and then into forgiveness.</w:t>
+      </w:r>
+      <w:r>
+        <w:t xml:space="preserve"> The story is told without walls of text: short animated cutscenes (a push-in, rain on the window, a charm flaring), one line at a time in each speaker’s voice, and a diary whose eleven pages are the story’s own pictures, one clue at a time. The tone is warm and a little melancholy, never grim.</w:t>
       </w:r>
     </w:p>
     <w:p>
@@ -4136,7 +4212,7 @@
         <w:t xml:space="preserve">A living place.</w:t>
       </w:r>
       <w:r>
-        <w:t xml:space="preserve"> Every customer speaks in a pitch-shifted, </w:t>
+        <w:t xml:space="preserve"> Every character speaks in a pitch-shifted, </w:t>
       </w:r>
       <w:r>
         <w:rPr>
@@ -4146,7 +4222,7 @@
         <w:t xml:space="preserve">Animalese</w:t>
       </w:r>
       <w:r>
-        <w:t xml:space="preserve">-style voice. The music is adaptive: a cosy shop theme crossfades into a tense forest theme the moment the heroes set off, and every event — a coin, a wax seal, a blast — has its own sound. Not one of these is an audio file: every note, effect and voice is synthesised by the game as it plays.</w:t>
+        <w:t xml:space="preserve">-style voice. The music is adaptive: a cosy shop theme crossfades into a tense forest theme the moment the heroes set off, and the story has its own — Grandmother’s kettle-charm lullaby, which returns in a major key when Tam wakes. Not one of these is an audio file: every note, effect and voice is synthesised by the game as it plays.</w:t>
       </w:r>
     </w:p>
     <w:p>
@@ -4188,7 +4264,7 @@
         <w:t xml:space="preserve">Rising stakes.</w:t>
       </w:r>
       <w:r>
-        <w:t xml:space="preserve"> Each region is harder than the last, the party grows, the mornings get more crowded, and the diary’s sketch grows more complete — all building to the Coven’s Peak and the reveal waiting behind it.</w:t>
+        <w:t xml:space="preserve"> Each region is harder than the last, the party grows, the mornings get more crowded, and the clues pile up — all building to the Coven’s Peak and the mask.</w:t>
       </w:r>
     </w:p>
     <w:p>
@@ -4869,7 +4945,7 @@
       <w:r>
         <w:drawing>
           <wp:inline distT="0" distB="0" distL="0" distR="0">
-            <wp:extent cx="5334000" cy="1143000"/>
+            <wp:extent cx="5334000" cy="1038225"/>
             <wp:effectExtent t="0" r="0" b="0" l="0"/>
             <wp:docPr id="1" name="stations.png" descr="The four stations: Counter, Prep, Cauldron, Bottling" title="The four stations: Counter, Prep, Cauldron, Bottling"/>
             <wp:cNvGraphicFramePr>
@@ -4894,7 +4970,7 @@
                   <pic:spPr bwMode="auto">
                     <a:xfrm>
                       <a:off x="0" y="0"/>
-                      <a:ext cx="5334000" cy="1143000"/>
+                      <a:ext cx="5334000" cy="1038225"/>
                     </a:xfrm>
                     <a:prstGeom prst="rect">
                       <a:avLst/>
@@ -4932,7 +5008,7 @@
           <w:b/>
           <w:bCs/>
         </w:rPr>
-        <w:t xml:space="preserve">The four stations.</w:t>
+        <w:t xml:space="preserve">Four physics benches.</w:t>
       </w:r>
       <w:r>
         <w:t xml:space="preserve"> </w:t>
@@ -4945,7 +5021,7 @@
         <w:t xml:space="preserve">Counter:</w:t>
       </w:r>
       <w:r>
-        <w:t xml:space="preserve"> pick one of three jobs — the safe standing order, a guild commission that pays double but refuses a sloppy flask, or the customer’s personal favourite, often the wrong element for the road. </w:t>
+        <w:t xml:space="preserve"> pick one of three jobs — the safe standing order, a guild commission that pays far more but refuses a sloppy flask, or the customer’s favourite, often the wrong element for the road. </w:t>
       </w:r>
       <w:r>
         <w:rPr>
@@ -4955,7 +5031,7 @@
         <w:t xml:space="preserve">Prep:</w:t>
       </w:r>
       <w:r>
-        <w:t xml:space="preserve"> crush the recipe’s leaves into the pot in order, then grind them in the mortar. </w:t>
+        <w:t xml:space="preserve"> toss the recipe’s leaves into the mortar (they fly on real arcs), then lift the pestle and let it drop: its speed at impact is the strike’s grade, and too hard throws a leaf out. </w:t>
       </w:r>
       <w:r>
         <w:rPr>
@@ -4965,7 +5041,7 @@
         <w:t xml:space="preserve">Cauldron:</w:t>
       </w:r>
       <w:r>
-        <w:t xml:space="preserve"> stir by physically turning the spoon around the pot in the direction the recipe demands, keeping the heat inside a band that drifts. </w:t>
+        <w:t xml:space="preserve"> stir the spoon round the pot the way the recipe turns; the herbs ride the vortex and dissolve, and stirring too hard slops them over the rim. </w:t>
       </w:r>
       <w:r>
         <w:rPr>
@@ -4975,7 +5051,7 @@
         <w:t xml:space="preserve">Bottling:</w:t>
       </w:r>
       <w:r>
-        <w:t xml:space="preserve"> tip a jug to pour to the line without spilling, seal on the beat, and label it right.</w:t>
+        <w:t xml:space="preserve"> tip the ladle on its hinge to pour real droplets to the line, press the cork home on the beat, and label it right.</w:t>
       </w:r>
     </w:p>
     <w:p>
@@ -6044,10 +6120,10 @@
           <w:b/>
           <w:bCs/>
         </w:rPr>
-        <w:t xml:space="preserve">Real physics.</w:t>
-      </w:r>
-      <w:r>
-        <w:t xml:space="preserve"> Herbs float and swirl in the cauldron under real forces and torque from the stirring; the mortar’s seeds and the bottling pour are real rigid bodies; flasks fly on true ballistic arcs and blasts knock monsters back.</w:t>
+        <w:t xml:space="preserve">Physics everywhere.</w:t>
+      </w:r>
+      <w:r>
+        <w:t xml:space="preserve"> Flasks and the guardians’ volleys fly on true ballistic arcs; blasts and slams knock bodies back with falloff; heroes step out of a guardian’s marked blows; the ice and the bog change how everyone moves; a fallen guardian comes apart into tumbling debris.</w:t>
       </w:r>
     </w:p>
     <w:p>
@@ -6769,7 +6845,7 @@
         <w:spacing w:after="70" w:before="150"/>
       </w:pPr>
       <w:r>
-        <w:t xml:space="preserve">Bosses: the forest’s guardians</w:t>
+        <w:t xml:space="preserve">Guardians</w:t>
       </w:r>
     </w:p>
     <w:tbl>
@@ -6787,8 +6863,9 @@
         <w:tblLayout w:type="fixed"/>
       </w:tblPr>
       <w:tblGrid>
-        <w:gridCol w:w="2300"/>
-        <w:gridCol w:w="7006"/>
+        <w:gridCol w:w="2100"/>
+        <w:gridCol w:w="5106"/>
+        <w:gridCol w:w="2100"/>
       </w:tblGrid>
       <w:tr>
         <w:trPr>
@@ -6796,7 +6873,7 @@
         </w:trPr>
         <w:tc>
           <w:tcPr>
-            <w:tcW w:type="dxa" w:w="2300"/>
+            <w:tcW w:type="dxa" w:w="2100"/>
             <w:tcMar>
               <w:top w:type="dxa" w:w="60"/>
               <w:left w:type="dxa" w:w="90"/>
@@ -6807,15 +6884,186 @@
           </w:tcPr>
           <w:p>
             <w:pPr>
-              <w:spacing w:after="60" w:before="60"/>
+              <w:spacing w:after="60" w:before="0"/>
               <w:jc w:val="center"/>
             </w:pPr>
             <w:r>
               <w:drawing>
                 <wp:inline distT="0" distB="0" distL="0" distR="0">
-                  <wp:extent cx="1123950" cy="1123950"/>
+                  <wp:extent cx="1428750" cy="1400175"/>
                   <wp:effectExtent t="0" r="0" b="0" l="0"/>
-                  <wp:docPr id="1" name="boss.png" descr="Boss" title="Boss"/>
+                  <wp:docPr id="1" name="boss_woodwose.png" descr="The Elder Woodwose, enraged" title="The Elder Woodwose, enraged"/>
+                  <wp:cNvGraphicFramePr>
+                    <a:graphicFrameLocks xmlns:a="http://schemas.openxmlformats.org/drawingml/2006/main" noChangeAspect="1"/>
+                  </wp:cNvGraphicFramePr>
+                  <a:graphic xmlns:a="http://schemas.openxmlformats.org/drawingml/2006/main">
+                    <a:graphicData uri="http://schemas.openxmlformats.org/drawingml/2006/picture">
+                      <pic:pic xmlns:pic="http://schemas.openxmlformats.org/drawingml/2006/picture">
+                        <pic:nvPicPr>
+                          <pic:cNvPr id="0" name="" descr=""/>
+                          <pic:cNvPicPr>
+                            <a:picLocks noChangeAspect="1" noChangeArrowheads="1"/>
+                          </pic:cNvPicPr>
+                        </pic:nvPicPr>
+                        <pic:blipFill>
+                          <a:blip r:embed="rId35" cstate="none"/>
+                          <a:srcRect/>
+                          <a:stretch>
+                            <a:fillRect/>
+                          </a:stretch>
+                        </pic:blipFill>
+                        <pic:spPr bwMode="auto">
+                          <a:xfrm>
+                            <a:off x="0" y="0"/>
+                            <a:ext cx="1428750" cy="1400175"/>
+                          </a:xfrm>
+                          <a:prstGeom prst="rect">
+                            <a:avLst/>
+                          </a:prstGeom>
+                        </pic:spPr>
+                      </pic:pic>
+                    </a:graphicData>
+                  </a:graphic>
+                </wp:inline>
+              </w:drawing>
+            </w:r>
+          </w:p>
+          <w:p>
+            <w:pPr>
+              <w:spacing w:after="40"/>
+              <w:jc w:val="center"/>
+            </w:pPr>
+            <w:r>
+              <w:rPr>
+                <w:i/>
+                <w:iCs/>
+                <w:color w:val="6B6275"/>
+                <w:sz w:val="15"/>
+                <w:szCs w:val="15"/>
+              </w:rPr>
+              <w:t xml:space="preserve">The Elder Woodwose</w:t>
+            </w:r>
+          </w:p>
+        </w:tc>
+        <w:tc>
+          <w:tcPr>
+            <w:tcW w:type="dxa" w:w="5106"/>
+            <w:tcMar>
+              <w:top w:type="dxa" w:w="60"/>
+              <w:left w:type="dxa" w:w="90"/>
+              <w:bottom w:type="dxa" w:w="60"/>
+              <w:right w:type="dxa" w:w="90"/>
+            </w:tcMar>
+            <w:vAlign w:val="top"/>
+          </w:tcPr>
+          <w:p>
+            <w:pPr>
+              <w:spacing w:after="50" w:before="0" w:line="264"/>
+              <w:jc w:val="both"/>
+            </w:pPr>
+            <w:r>
+              <w:t xml:space="preserve">The </w:t>
+            </w:r>
+            <w:r>
+              <w:rPr>
+                <w:b/>
+                <w:bCs/>
+              </w:rPr>
+              <w:t xml:space="preserve">Elder Woodwose</w:t>
+            </w:r>
+            <w:r>
+              <w:t xml:space="preserve"> (Nature) is an antlered giant of bark and moss with a heart-knot that beats like a coal; it waits at the end of the Whispering Woods once the road has been cleared. The </w:t>
+            </w:r>
+            <w:r>
+              <w:rPr>
+                <w:b/>
+                <w:bCs/>
+              </w:rPr>
+              <w:t xml:space="preserve">Coven Matriarch</w:t>
+            </w:r>
+            <w:r>
+              <w:t xml:space="preserve"> (Arcane) floats at the summit. Every blow is </w:t>
+            </w:r>
+            <w:r>
+              <w:rPr>
+                <w:b/>
+                <w:bCs/>
+              </w:rPr>
+              <w:t xml:space="preserve">telegraphed</w:t>
+            </w:r>
+            <w:r>
+              <w:t xml:space="preserve">: the guardian winds up in a pose that matches the attack and marks each spot it will hit on the ground, and heroes step out of the marks. Guardians are not scripted: they weigh their health, the damage just taken and how hard one element is pressing, and shift between four phases shown on screen. Their health is sized to the party they face.</w:t>
+            </w:r>
+          </w:p>
+          <w:p>
+            <w:pPr>
+              <w:spacing w:after="0" w:before="0"/>
+              <w:jc w:val="center"/>
+            </w:pPr>
+            <w:r>
+              <w:drawing>
+                <wp:inline distT="0" distB="0" distL="0" distR="0">
+                  <wp:extent cx="2857500" cy="495300"/>
+                  <wp:effectExtent t="0" r="0" b="0" l="0"/>
+                  <wp:docPr id="1" name="boss_phases.png" descr="Boss health bar and phase indicator" title="Boss health bar and phase indicator"/>
+                  <wp:cNvGraphicFramePr>
+                    <a:graphicFrameLocks xmlns:a="http://schemas.openxmlformats.org/drawingml/2006/main" noChangeAspect="1"/>
+                  </wp:cNvGraphicFramePr>
+                  <a:graphic xmlns:a="http://schemas.openxmlformats.org/drawingml/2006/main">
+                    <a:graphicData uri="http://schemas.openxmlformats.org/drawingml/2006/picture">
+                      <pic:pic xmlns:pic="http://schemas.openxmlformats.org/drawingml/2006/picture">
+                        <pic:nvPicPr>
+                          <pic:cNvPr id="0" name="" descr=""/>
+                          <pic:cNvPicPr>
+                            <a:picLocks noChangeAspect="1" noChangeArrowheads="1"/>
+                          </pic:cNvPicPr>
+                        </pic:nvPicPr>
+                        <pic:blipFill>
+                          <a:blip r:embed="rId36" cstate="none"/>
+                          <a:srcRect/>
+                          <a:stretch>
+                            <a:fillRect/>
+                          </a:stretch>
+                        </pic:blipFill>
+                        <pic:spPr bwMode="auto">
+                          <a:xfrm>
+                            <a:off x="0" y="0"/>
+                            <a:ext cx="2857500" cy="495300"/>
+                          </a:xfrm>
+                          <a:prstGeom prst="rect">
+                            <a:avLst/>
+                          </a:prstGeom>
+                        </pic:spPr>
+                      </pic:pic>
+                    </a:graphicData>
+                  </a:graphic>
+                </wp:inline>
+              </w:drawing>
+            </w:r>
+          </w:p>
+        </w:tc>
+        <w:tc>
+          <w:tcPr>
+            <w:tcW w:type="dxa" w:w="2100"/>
+            <w:tcMar>
+              <w:top w:type="dxa" w:w="60"/>
+              <w:left w:type="dxa" w:w="90"/>
+              <w:bottom w:type="dxa" w:w="60"/>
+              <w:right w:type="dxa" w:w="90"/>
+            </w:tcMar>
+            <w:vAlign w:val="top"/>
+          </w:tcPr>
+          <w:p>
+            <w:pPr>
+              <w:spacing w:after="60" w:before="0"/>
+              <w:jc w:val="center"/>
+            </w:pPr>
+            <w:r>
+              <w:drawing>
+                <wp:inline distT="0" distB="0" distL="0" distR="0">
+                  <wp:extent cx="1238250" cy="1181100"/>
+                  <wp:effectExtent t="0" r="0" b="0" l="0"/>
+                  <wp:docPr id="1" name="boss_matriarch.png" descr="The Coven Matriarch" title="The Coven Matriarch"/>
                   <wp:cNvGraphicFramePr>
                     <a:graphicFrameLocks xmlns:a="http://schemas.openxmlformats.org/drawingml/2006/main" noChangeAspect="1"/>
                   </wp:cNvGraphicFramePr>
@@ -6838,7 +7086,7 @@
                         <pic:spPr bwMode="auto">
                           <a:xfrm>
                             <a:off x="0" y="0"/>
-                            <a:ext cx="1123950" cy="1123950"/>
+                            <a:ext cx="1238250" cy="1181100"/>
                           </a:xfrm>
                           <a:prstGeom prst="rect">
                             <a:avLst/>
@@ -6868,100 +7116,8 @@
             </w:r>
           </w:p>
         </w:tc>
-        <w:tc>
-          <w:tcPr>
-            <w:tcW w:type="dxa" w:w="7006"/>
-            <w:tcMar>
-              <w:top w:type="dxa" w:w="60"/>
-              <w:left w:type="dxa" w:w="90"/>
-              <w:bottom w:type="dxa" w:w="60"/>
-              <w:right w:type="dxa" w:w="90"/>
-            </w:tcMar>
-            <w:vAlign w:val="top"/>
-          </w:tcPr>
-          <w:p>
-            <w:pPr>
-              <w:spacing w:after="70" w:before="0" w:line="264"/>
-              <w:jc w:val="both"/>
-            </w:pPr>
-            <w:r>
-              <w:t xml:space="preserve">Each region ends at a guardian holding part of the cure — among them the </w:t>
-            </w:r>
-            <w:r>
-              <w:rPr>
-                <w:b/>
-                <w:bCs/>
-              </w:rPr>
-              <w:t xml:space="preserve">Elder Woodwose</w:t>
-            </w:r>
-            <w:r>
-              <w:t xml:space="preserve"> (Nature, 300 HP) at the end of the Whispering Woods and the </w:t>
-            </w:r>
-            <w:r>
-              <w:rPr>
-                <w:b/>
-                <w:bCs/>
-              </w:rPr>
-              <w:t xml:space="preserve">Coven Matriarch</w:t>
-            </w:r>
-            <w:r>
-              <w:t xml:space="preserve"> (Arcane, 520 HP) at the summit. Bosses are not scripted either: they constantly weigh their own health, the damage they have just taken and how hard any single element is pressing them, and shift between four phases the player can read on screen.</w:t>
-            </w:r>
-          </w:p>
-          <w:p>
-            <w:pPr>
-              <w:spacing w:after="0" w:before="0"/>
-              <w:jc w:val="center"/>
-            </w:pPr>
-            <w:r>
-              <w:drawing>
-                <wp:inline distT="0" distB="0" distL="0" distR="0">
-                  <wp:extent cx="3143250" cy="542925"/>
-                  <wp:effectExtent t="0" r="0" b="0" l="0"/>
-                  <wp:docPr id="1" name="boss_phases.png" descr="Boss health bar and phase indicator" title="Boss health bar and phase indicator"/>
-                  <wp:cNvGraphicFramePr>
-                    <a:graphicFrameLocks xmlns:a="http://schemas.openxmlformats.org/drawingml/2006/main" noChangeAspect="1"/>
-                  </wp:cNvGraphicFramePr>
-                  <a:graphic xmlns:a="http://schemas.openxmlformats.org/drawingml/2006/main">
-                    <a:graphicData uri="http://schemas.openxmlformats.org/drawingml/2006/picture">
-                      <pic:pic xmlns:pic="http://schemas.openxmlformats.org/drawingml/2006/picture">
-                        <pic:nvPicPr>
-                          <pic:cNvPr id="0" name="" descr=""/>
-                          <pic:cNvPicPr>
-                            <a:picLocks noChangeAspect="1" noChangeArrowheads="1"/>
-                          </pic:cNvPicPr>
-                        </pic:nvPicPr>
-                        <pic:blipFill>
-                          <a:blip r:embed="rId35" cstate="none"/>
-                          <a:srcRect/>
-                          <a:stretch>
-                            <a:fillRect/>
-                          </a:stretch>
-                        </pic:blipFill>
-                        <pic:spPr bwMode="auto">
-                          <a:xfrm>
-                            <a:off x="0" y="0"/>
-                            <a:ext cx="3143250" cy="542925"/>
-                          </a:xfrm>
-                          <a:prstGeom prst="rect">
-                            <a:avLst/>
-                          </a:prstGeom>
-                        </pic:spPr>
-                      </pic:pic>
-                    </a:graphicData>
-                  </a:graphic>
-                </wp:inline>
-              </w:drawing>
-            </w:r>
-          </w:p>
-        </w:tc>
       </w:tr>
     </w:tbl>
-    <w:p>
-      <w:pPr>
-        <w:spacing w:after="40"/>
-      </w:pPr>
-    </w:p>
     <w:p>
       <w:pPr>
         <w:pStyle w:val="ListParagraph"/>
@@ -6980,7 +7136,17 @@
         <w:t xml:space="preserve">Neutral</w:t>
       </w:r>
       <w:r>
-        <w:t xml:space="preserve"> — measured, long-range Arcane Bolts; nothing resisted. The boss’s default while healthy.</w:t>
+        <w:t xml:space="preserve"> — measured attacks, nothing resisted.  </w:t>
+      </w:r>
+      <w:r>
+        <w:rPr>
+          <w:b/>
+          <w:bCs/>
+        </w:rPr>
+        <w:t xml:space="preserve">Enraged</w:t>
+      </w:r>
+      <w:r>
+        <w:t xml:space="preserve"> — cracks and sigils burn, eyes go red, it moves faster and hits harder.</w:t>
       </w:r>
     </w:p>
     <w:p>
@@ -6990,28 +7156,7 @@
           <w:ilvl w:val="0"/>
           <w:numId w:val="2"/>
         </w:numPr>
-        <w:spacing w:after="55" w:line="252"/>
-        <w:jc w:val="left"/>
-      </w:pPr>
-      <w:r>
-        <w:rPr>
-          <w:b/>
-          <w:bCs/>
-        </w:rPr>
-        <w:t xml:space="preserve">Enraged</w:t>
-      </w:r>
-      <w:r>
-        <w:t xml:space="preserve"> — as its health drops the boss turns aggressive, adding a heavy close-range Coven Slam to its bolts.</w:t>
-      </w:r>
-    </w:p>
-    <w:p>
-      <w:pPr>
-        <w:pStyle w:val="ListParagraph"/>
-        <w:numPr>
-          <w:ilvl w:val="0"/>
-          <w:numId w:val="2"/>
-        </w:numPr>
-        <w:spacing w:after="55" w:line="252"/>
+        <w:spacing w:after="80" w:line="252"/>
         <w:jc w:val="left"/>
       </w:pPr>
       <w:r>
@@ -7022,19 +7167,8 @@
         <w:t xml:space="preserve">Elemental Ward</w:t>
       </w:r>
       <w:r>
-        <w:t xml:space="preserve"> — hammer a boss with one element and it raises a ward against exactly that element, answering with a Ward Pulse. The heroes have to switch flasks — and the player learns to brew more than one element for a boss day.</w:t>
-      </w:r>
-    </w:p>
-    <w:p>
-      <w:pPr>
-        <w:pStyle w:val="ListParagraph"/>
-        <w:numPr>
-          <w:ilvl w:val="0"/>
-          <w:numId w:val="2"/>
-        </w:numPr>
-        <w:spacing w:after="110" w:line="252"/>
-        <w:jc w:val="left"/>
-      </w:pPr>
+        <w:t xml:space="preserve"> — hammer it with one element and a ring of runes wards it against exactly that one: the heroes must switch flasks.  </w:t>
+      </w:r>
       <w:r>
         <w:rPr>
           <w:b/>
@@ -7043,7 +7177,7 @@
         <w:t xml:space="preserve">Recovering</w:t>
       </w:r>
       <w:r>
-        <w:t xml:space="preserve"> — badly hurt and under heavy fire, it stops attacking to recover. The window to finish it.</w:t>
+        <w:t xml:space="preserve"> — it slumps and sheds pieces of itself: the window to finish it.</w:t>
       </w:r>
     </w:p>
     <w:tbl>
@@ -7061,11 +7195,11 @@
         <w:tblLayout w:type="fixed"/>
       </w:tblPr>
       <w:tblGrid>
-        <w:gridCol w:w="2000"/>
+        <w:gridCol w:w="2500"/>
         <w:gridCol w:w="1300"/>
-        <w:gridCol w:w="2700"/>
-        <w:gridCol w:w="1100"/>
-        <w:gridCol w:w="2206"/>
+        <w:gridCol w:w="2600"/>
+        <w:gridCol w:w="1000"/>
+        <w:gridCol w:w="1906"/>
       </w:tblGrid>
       <w:tr>
         <w:trPr>
@@ -7074,7 +7208,7 @@
         </w:trPr>
         <w:tc>
           <w:tcPr>
-            <w:tcW w:type="dxa" w:w="2000"/>
+            <w:tcW w:type="dxa" w:w="2500"/>
             <w:shd w:fill="EFE9F3" w:color="auto" w:val="clear"/>
             <w:tcMar>
               <w:top w:type="dxa" w:w="45"/>
@@ -7093,10 +7227,10 @@
               <w:rPr>
                 <w:b/>
                 <w:bCs/>
-                <w:sz w:val="16"/>
-                <w:szCs w:val="16"/>
-              </w:rPr>
-              <w:t xml:space="preserve">Guardian attack</w:t>
+                <w:sz w:val="15"/>
+                <w:szCs w:val="15"/>
+              </w:rPr>
+              <w:t xml:space="preserve">Attack</w:t>
             </w:r>
           </w:p>
         </w:tc>
@@ -7121,16 +7255,16 @@
               <w:rPr>
                 <w:b/>
                 <w:bCs/>
-                <w:sz w:val="16"/>
-                <w:szCs w:val="16"/>
-              </w:rPr>
-              <w:t xml:space="preserve">Element</w:t>
-            </w:r>
-          </w:p>
-        </w:tc>
-        <w:tc>
-          <w:tcPr>
-            <w:tcW w:type="dxa" w:w="2700"/>
+                <w:sz w:val="15"/>
+                <w:szCs w:val="15"/>
+              </w:rPr>
+              <w:t xml:space="preserve">Guardian</w:t>
+            </w:r>
+          </w:p>
+        </w:tc>
+        <w:tc>
+          <w:tcPr>
+            <w:tcW w:type="dxa" w:w="2600"/>
             <w:shd w:fill="EFE9F3" w:color="auto" w:val="clear"/>
             <w:tcMar>
               <w:top w:type="dxa" w:w="45"/>
@@ -7149,16 +7283,16 @@
               <w:rPr>
                 <w:b/>
                 <w:bCs/>
-                <w:sz w:val="16"/>
-                <w:szCs w:val="16"/>
-              </w:rPr>
-              <w:t xml:space="preserve">Reach</w:t>
-            </w:r>
-          </w:p>
-        </w:tc>
-        <w:tc>
-          <w:tcPr>
-            <w:tcW w:type="dxa" w:w="1100"/>
+                <w:sz w:val="15"/>
+                <w:szCs w:val="15"/>
+              </w:rPr>
+              <w:t xml:space="preserve">Shape</w:t>
+            </w:r>
+          </w:p>
+        </w:tc>
+        <w:tc>
+          <w:tcPr>
+            <w:tcW w:type="dxa" w:w="1000"/>
             <w:shd w:fill="EFE9F3" w:color="auto" w:val="clear"/>
             <w:tcMar>
               <w:top w:type="dxa" w:w="45"/>
@@ -7177,8 +7311,8 @@
               <w:rPr>
                 <w:b/>
                 <w:bCs/>
-                <w:sz w:val="16"/>
-                <w:szCs w:val="16"/>
+                <w:sz w:val="15"/>
+                <w:szCs w:val="15"/>
               </w:rPr>
               <w:t xml:space="preserve">Damage</w:t>
             </w:r>
@@ -7186,7 +7320,7 @@
         </w:tc>
         <w:tc>
           <w:tcPr>
-            <w:tcW w:type="dxa" w:w="2206"/>
+            <w:tcW w:type="dxa" w:w="1906"/>
             <w:shd w:fill="EFE9F3" w:color="auto" w:val="clear"/>
             <w:tcMar>
               <w:top w:type="dxa" w:w="45"/>
@@ -7205,10 +7339,10 @@
               <w:rPr>
                 <w:b/>
                 <w:bCs/>
-                <w:sz w:val="16"/>
-                <w:szCs w:val="16"/>
-              </w:rPr>
-              <w:t xml:space="preserve">Used in</w:t>
+                <w:sz w:val="15"/>
+                <w:szCs w:val="15"/>
+              </w:rPr>
+              <w:t xml:space="preserve">Phase</w:t>
             </w:r>
           </w:p>
         </w:tc>
@@ -7219,7 +7353,7 @@
         </w:trPr>
         <w:tc>
           <w:tcPr>
-            <w:tcW w:type="dxa" w:w="2000"/>
+            <w:tcW w:type="dxa" w:w="2500"/>
             <w:tcMar>
               <w:top w:type="dxa" w:w="45"/>
               <w:left w:type="dxa" w:w="90"/>
@@ -7237,10 +7371,10 @@
               <w:rPr>
                 <w:b/>
                 <w:bCs/>
-                <w:sz w:val="16"/>
-                <w:szCs w:val="16"/>
-              </w:rPr>
-              <w:t xml:space="preserve">Arcane Bolt</w:t>
+                <w:sz w:val="15"/>
+                <w:szCs w:val="15"/>
+              </w:rPr>
+              <w:t xml:space="preserve">Bramble Swipe</w:t>
             </w:r>
           </w:p>
         </w:tc>
@@ -7264,16 +7398,16 @@
               <w:rPr>
                 <w:b w:val="false"/>
                 <w:bCs w:val="false"/>
-                <w:sz w:val="16"/>
-                <w:szCs w:val="16"/>
-              </w:rPr>
-              <w:t xml:space="preserve">Arcane</w:t>
-            </w:r>
-          </w:p>
-        </w:tc>
-        <w:tc>
-          <w:tcPr>
-            <w:tcW w:type="dxa" w:w="2700"/>
+                <w:sz w:val="15"/>
+                <w:szCs w:val="15"/>
+              </w:rPr>
+              <w:t xml:space="preserve">Woodwose</w:t>
+            </w:r>
+          </w:p>
+        </w:tc>
+        <w:tc>
+          <w:tcPr>
+            <w:tcW w:type="dxa" w:w="2600"/>
             <w:tcMar>
               <w:top w:type="dxa" w:w="45"/>
               <w:left w:type="dxa" w:w="90"/>
@@ -7291,16 +7425,16 @@
               <w:rPr>
                 <w:b w:val="false"/>
                 <w:bCs w:val="false"/>
-                <w:sz w:val="16"/>
-                <w:szCs w:val="16"/>
-              </w:rPr>
-              <w:t xml:space="preserve">Long range, small blast</w:t>
-            </w:r>
-          </w:p>
-        </w:tc>
-        <w:tc>
-          <w:tcPr>
-            <w:tcW w:type="dxa" w:w="1100"/>
+                <w:sz w:val="15"/>
+                <w:szCs w:val="15"/>
+              </w:rPr>
+              <w:t xml:space="preserve">Strike on a marked spot</w:t>
+            </w:r>
+          </w:p>
+        </w:tc>
+        <w:tc>
+          <w:tcPr>
+            <w:tcW w:type="dxa" w:w="1000"/>
             <w:tcMar>
               <w:top w:type="dxa" w:w="45"/>
               <w:left w:type="dxa" w:w="90"/>
@@ -7318,16 +7452,16 @@
               <w:rPr>
                 <w:b w:val="false"/>
                 <w:bCs w:val="false"/>
-                <w:sz w:val="16"/>
-                <w:szCs w:val="16"/>
-              </w:rPr>
-              <w:t xml:space="preserve">10</w:t>
-            </w:r>
-          </w:p>
-        </w:tc>
-        <w:tc>
-          <w:tcPr>
-            <w:tcW w:type="dxa" w:w="2206"/>
+                <w:sz w:val="15"/>
+                <w:szCs w:val="15"/>
+              </w:rPr>
+              <w:t xml:space="preserve">14</w:t>
+            </w:r>
+          </w:p>
+        </w:tc>
+        <w:tc>
+          <w:tcPr>
+            <w:tcW w:type="dxa" w:w="1906"/>
             <w:tcMar>
               <w:top w:type="dxa" w:w="45"/>
               <w:left w:type="dxa" w:w="90"/>
@@ -7345,8 +7479,8 @@
               <w:rPr>
                 <w:b w:val="false"/>
                 <w:bCs w:val="false"/>
-                <w:sz w:val="16"/>
-                <w:szCs w:val="16"/>
+                <w:sz w:val="15"/>
+                <w:szCs w:val="15"/>
               </w:rPr>
               <w:t xml:space="preserve">Neutral, Enraged</w:t>
             </w:r>
@@ -7359,7 +7493,7 @@
         </w:trPr>
         <w:tc>
           <w:tcPr>
-            <w:tcW w:type="dxa" w:w="2000"/>
+            <w:tcW w:type="dxa" w:w="2500"/>
             <w:tcMar>
               <w:top w:type="dxa" w:w="45"/>
               <w:left w:type="dxa" w:w="90"/>
@@ -7377,10 +7511,10 @@
               <w:rPr>
                 <w:b/>
                 <w:bCs/>
-                <w:sz w:val="16"/>
-                <w:szCs w:val="16"/>
-              </w:rPr>
-              <w:t xml:space="preserve">Coven Slam</w:t>
+                <w:sz w:val="15"/>
+                <w:szCs w:val="15"/>
+              </w:rPr>
+              <w:t xml:space="preserve">Thorn Volley</w:t>
             </w:r>
           </w:p>
         </w:tc>
@@ -7404,16 +7538,16 @@
               <w:rPr>
                 <w:b w:val="false"/>
                 <w:bCs w:val="false"/>
-                <w:sz w:val="16"/>
-                <w:szCs w:val="16"/>
-              </w:rPr>
-              <w:t xml:space="preserve">Nature</w:t>
-            </w:r>
-          </w:p>
-        </w:tc>
-        <w:tc>
-          <w:tcPr>
-            <w:tcW w:type="dxa" w:w="2700"/>
+                <w:sz w:val="15"/>
+                <w:szCs w:val="15"/>
+              </w:rPr>
+              <w:t xml:space="preserve">Woodwose</w:t>
+            </w:r>
+          </w:p>
+        </w:tc>
+        <w:tc>
+          <w:tcPr>
+            <w:tcW w:type="dxa" w:w="2600"/>
             <w:tcMar>
               <w:top w:type="dxa" w:w="45"/>
               <w:left w:type="dxa" w:w="90"/>
@@ -7431,16 +7565,16 @@
               <w:rPr>
                 <w:b w:val="false"/>
                 <w:bCs w:val="false"/>
-                <w:sz w:val="16"/>
-                <w:szCs w:val="16"/>
-              </w:rPr>
-              <w:t xml:space="preserve">Close range, wide blast</w:t>
-            </w:r>
-          </w:p>
-        </w:tc>
-        <w:tc>
-          <w:tcPr>
-            <w:tcW w:type="dxa" w:w="1100"/>
+                <w:sz w:val="15"/>
+                <w:szCs w:val="15"/>
+              </w:rPr>
+              <w:t xml:space="preserve">Five thorns, flat and fast</w:t>
+            </w:r>
+          </w:p>
+        </w:tc>
+        <w:tc>
+          <w:tcPr>
+            <w:tcW w:type="dxa" w:w="1000"/>
             <w:tcMar>
               <w:top w:type="dxa" w:w="45"/>
               <w:left w:type="dxa" w:w="90"/>
@@ -7458,16 +7592,16 @@
               <w:rPr>
                 <w:b w:val="false"/>
                 <w:bCs w:val="false"/>
-                <w:sz w:val="16"/>
-                <w:szCs w:val="16"/>
-              </w:rPr>
-              <w:t xml:space="preserve">18</w:t>
-            </w:r>
-          </w:p>
-        </w:tc>
-        <w:tc>
-          <w:tcPr>
-            <w:tcW w:type="dxa" w:w="2206"/>
+                <w:sz w:val="15"/>
+                <w:szCs w:val="15"/>
+              </w:rPr>
+              <w:t xml:space="preserve">9 each</w:t>
+            </w:r>
+          </w:p>
+        </w:tc>
+        <w:tc>
+          <w:tcPr>
+            <w:tcW w:type="dxa" w:w="1906"/>
             <w:tcMar>
               <w:top w:type="dxa" w:w="45"/>
               <w:left w:type="dxa" w:w="90"/>
@@ -7485,10 +7619,10 @@
               <w:rPr>
                 <w:b w:val="false"/>
                 <w:bCs w:val="false"/>
-                <w:sz w:val="16"/>
-                <w:szCs w:val="16"/>
-              </w:rPr>
-              <w:t xml:space="preserve">Enraged</w:t>
+                <w:sz w:val="15"/>
+                <w:szCs w:val="15"/>
+              </w:rPr>
+              <w:t xml:space="preserve">Neutral, Enraged</w:t>
             </w:r>
           </w:p>
         </w:tc>
@@ -7499,7 +7633,7 @@
         </w:trPr>
         <w:tc>
           <w:tcPr>
-            <w:tcW w:type="dxa" w:w="2000"/>
+            <w:tcW w:type="dxa" w:w="2500"/>
             <w:tcMar>
               <w:top w:type="dxa" w:w="45"/>
               <w:left w:type="dxa" w:w="90"/>
@@ -7517,10 +7651,10 @@
               <w:rPr>
                 <w:b/>
                 <w:bCs/>
-                <w:sz w:val="16"/>
-                <w:szCs w:val="16"/>
-              </w:rPr>
-              <w:t xml:space="preserve">Ward Pulse</w:t>
+                <w:sz w:val="15"/>
+                <w:szCs w:val="15"/>
+              </w:rPr>
+              <w:t xml:space="preserve">Root Slam</w:t>
             </w:r>
           </w:p>
         </w:tc>
@@ -7544,16 +7678,16 @@
               <w:rPr>
                 <w:b w:val="false"/>
                 <w:bCs w:val="false"/>
-                <w:sz w:val="16"/>
-                <w:szCs w:val="16"/>
-              </w:rPr>
-              <w:t xml:space="preserve">Water</w:t>
-            </w:r>
-          </w:p>
-        </w:tc>
-        <w:tc>
-          <w:tcPr>
-            <w:tcW w:type="dxa" w:w="2700"/>
+                <w:sz w:val="15"/>
+                <w:szCs w:val="15"/>
+              </w:rPr>
+              <w:t xml:space="preserve">Woodwose</w:t>
+            </w:r>
+          </w:p>
+        </w:tc>
+        <w:tc>
+          <w:tcPr>
+            <w:tcW w:type="dxa" w:w="2600"/>
             <w:tcMar>
               <w:top w:type="dxa" w:w="45"/>
               <w:left w:type="dxa" w:w="90"/>
@@ -7571,16 +7705,16 @@
               <w:rPr>
                 <w:b w:val="false"/>
                 <w:bCs w:val="false"/>
-                <w:sz w:val="16"/>
-                <w:szCs w:val="16"/>
-              </w:rPr>
-              <w:t xml:space="preserve">A burst around itself</w:t>
-            </w:r>
-          </w:p>
-        </w:tc>
-        <w:tc>
-          <w:tcPr>
-            <w:tcW w:type="dxa" w:w="1100"/>
+                <w:sz w:val="15"/>
+                <w:szCs w:val="15"/>
+              </w:rPr>
+              <w:t xml:space="preserve">Shockwave around itself</w:t>
+            </w:r>
+          </w:p>
+        </w:tc>
+        <w:tc>
+          <w:tcPr>
+            <w:tcW w:type="dxa" w:w="1000"/>
             <w:tcMar>
               <w:top w:type="dxa" w:w="45"/>
               <w:left w:type="dxa" w:w="90"/>
@@ -7598,16 +7732,16 @@
               <w:rPr>
                 <w:b w:val="false"/>
                 <w:bCs w:val="false"/>
-                <w:sz w:val="16"/>
-                <w:szCs w:val="16"/>
-              </w:rPr>
-              <w:t xml:space="preserve">8</w:t>
-            </w:r>
-          </w:p>
-        </w:tc>
-        <w:tc>
-          <w:tcPr>
-            <w:tcW w:type="dxa" w:w="2206"/>
+                <w:sz w:val="15"/>
+                <w:szCs w:val="15"/>
+              </w:rPr>
+              <w:t xml:space="preserve">20</w:t>
+            </w:r>
+          </w:p>
+        </w:tc>
+        <w:tc>
+          <w:tcPr>
+            <w:tcW w:type="dxa" w:w="1906"/>
             <w:tcMar>
               <w:top w:type="dxa" w:w="45"/>
               <w:left w:type="dxa" w:w="90"/>
@@ -7625,10 +7759,430 @@
               <w:rPr>
                 <w:b w:val="false"/>
                 <w:bCs w:val="false"/>
-                <w:sz w:val="16"/>
-                <w:szCs w:val="16"/>
-              </w:rPr>
-              <w:t xml:space="preserve">Elemental Ward</w:t>
+                <w:sz w:val="15"/>
+                <w:szCs w:val="15"/>
+              </w:rPr>
+              <w:t xml:space="preserve">Enraged</w:t>
+            </w:r>
+          </w:p>
+        </w:tc>
+      </w:tr>
+      <w:tr>
+        <w:trPr>
+          <w:cantSplit/>
+        </w:trPr>
+        <w:tc>
+          <w:tcPr>
+            <w:tcW w:type="dxa" w:w="2500"/>
+            <w:tcMar>
+              <w:top w:type="dxa" w:w="45"/>
+              <w:left w:type="dxa" w:w="90"/>
+              <w:bottom w:type="dxa" w:w="45"/>
+              <w:right w:type="dxa" w:w="90"/>
+            </w:tcMar>
+            <w:vAlign w:val="top"/>
+          </w:tcPr>
+          <w:p>
+            <w:pPr>
+              <w:spacing w:after="0" w:line="240"/>
+              <w:jc w:val="left"/>
+            </w:pPr>
+            <w:r>
+              <w:rPr>
+                <w:b/>
+                <w:bCs/>
+                <w:sz w:val="15"/>
+                <w:szCs w:val="15"/>
+              </w:rPr>
+              <w:t xml:space="preserve">Hex Volley / Hex Storm</w:t>
+            </w:r>
+          </w:p>
+        </w:tc>
+        <w:tc>
+          <w:tcPr>
+            <w:tcW w:type="dxa" w:w="1300"/>
+            <w:tcMar>
+              <w:top w:type="dxa" w:w="45"/>
+              <w:left w:type="dxa" w:w="90"/>
+              <w:bottom w:type="dxa" w:w="45"/>
+              <w:right w:type="dxa" w:w="90"/>
+            </w:tcMar>
+            <w:vAlign w:val="top"/>
+          </w:tcPr>
+          <w:p>
+            <w:pPr>
+              <w:spacing w:after="0" w:line="240"/>
+              <w:jc w:val="left"/>
+            </w:pPr>
+            <w:r>
+              <w:rPr>
+                <w:b w:val="false"/>
+                <w:bCs w:val="false"/>
+                <w:sz w:val="15"/>
+                <w:szCs w:val="15"/>
+              </w:rPr>
+              <w:t xml:space="preserve">Matriarch</w:t>
+            </w:r>
+          </w:p>
+        </w:tc>
+        <w:tc>
+          <w:tcPr>
+            <w:tcW w:type="dxa" w:w="2600"/>
+            <w:tcMar>
+              <w:top w:type="dxa" w:w="45"/>
+              <w:left w:type="dxa" w:w="90"/>
+              <w:bottom w:type="dxa" w:w="45"/>
+              <w:right w:type="dxa" w:w="90"/>
+            </w:tcMar>
+            <w:vAlign w:val="top"/>
+          </w:tcPr>
+          <w:p>
+            <w:pPr>
+              <w:spacing w:after="0" w:line="240"/>
+              <w:jc w:val="left"/>
+            </w:pPr>
+            <w:r>
+              <w:rPr>
+                <w:b w:val="false"/>
+                <w:bCs w:val="false"/>
+                <w:sz w:val="15"/>
+                <w:szCs w:val="15"/>
+              </w:rPr>
+              <w:t xml:space="preserve">Three / seven lobbed hexes</w:t>
+            </w:r>
+          </w:p>
+        </w:tc>
+        <w:tc>
+          <w:tcPr>
+            <w:tcW w:type="dxa" w:w="1000"/>
+            <w:tcMar>
+              <w:top w:type="dxa" w:w="45"/>
+              <w:left w:type="dxa" w:w="90"/>
+              <w:bottom w:type="dxa" w:w="45"/>
+              <w:right w:type="dxa" w:w="90"/>
+            </w:tcMar>
+            <w:vAlign w:val="top"/>
+          </w:tcPr>
+          <w:p>
+            <w:pPr>
+              <w:spacing w:after="0" w:line="240"/>
+              <w:jc w:val="center"/>
+            </w:pPr>
+            <w:r>
+              <w:rPr>
+                <w:b w:val="false"/>
+                <w:bCs w:val="false"/>
+                <w:sz w:val="15"/>
+                <w:szCs w:val="15"/>
+              </w:rPr>
+              <w:t xml:space="preserve">11 / 9</w:t>
+            </w:r>
+          </w:p>
+        </w:tc>
+        <w:tc>
+          <w:tcPr>
+            <w:tcW w:type="dxa" w:w="1906"/>
+            <w:tcMar>
+              <w:top w:type="dxa" w:w="45"/>
+              <w:left w:type="dxa" w:w="90"/>
+              <w:bottom w:type="dxa" w:w="45"/>
+              <w:right w:type="dxa" w:w="90"/>
+            </w:tcMar>
+            <w:vAlign w:val="top"/>
+          </w:tcPr>
+          <w:p>
+            <w:pPr>
+              <w:spacing w:after="0" w:line="240"/>
+              <w:jc w:val="left"/>
+            </w:pPr>
+            <w:r>
+              <w:rPr>
+                <w:b w:val="false"/>
+                <w:bCs w:val="false"/>
+                <w:sz w:val="15"/>
+                <w:szCs w:val="15"/>
+              </w:rPr>
+              <w:t xml:space="preserve">Neutral, Ward / Enraged</w:t>
+            </w:r>
+          </w:p>
+        </w:tc>
+      </w:tr>
+      <w:tr>
+        <w:trPr>
+          <w:cantSplit/>
+        </w:trPr>
+        <w:tc>
+          <w:tcPr>
+            <w:tcW w:type="dxa" w:w="2500"/>
+            <w:tcMar>
+              <w:top w:type="dxa" w:w="45"/>
+              <w:left w:type="dxa" w:w="90"/>
+              <w:bottom w:type="dxa" w:w="45"/>
+              <w:right w:type="dxa" w:w="90"/>
+            </w:tcMar>
+            <w:vAlign w:val="top"/>
+          </w:tcPr>
+          <w:p>
+            <w:pPr>
+              <w:spacing w:after="0" w:line="240"/>
+              <w:jc w:val="left"/>
+            </w:pPr>
+            <w:r>
+              <w:rPr>
+                <w:b/>
+                <w:bCs/>
+                <w:sz w:val="15"/>
+                <w:szCs w:val="15"/>
+              </w:rPr>
+              <w:t xml:space="preserve">Coven Slam</w:t>
+            </w:r>
+          </w:p>
+        </w:tc>
+        <w:tc>
+          <w:tcPr>
+            <w:tcW w:type="dxa" w:w="1300"/>
+            <w:tcMar>
+              <w:top w:type="dxa" w:w="45"/>
+              <w:left w:type="dxa" w:w="90"/>
+              <w:bottom w:type="dxa" w:w="45"/>
+              <w:right w:type="dxa" w:w="90"/>
+            </w:tcMar>
+            <w:vAlign w:val="top"/>
+          </w:tcPr>
+          <w:p>
+            <w:pPr>
+              <w:spacing w:after="0" w:line="240"/>
+              <w:jc w:val="left"/>
+            </w:pPr>
+            <w:r>
+              <w:rPr>
+                <w:b w:val="false"/>
+                <w:bCs w:val="false"/>
+                <w:sz w:val="15"/>
+                <w:szCs w:val="15"/>
+              </w:rPr>
+              <w:t xml:space="preserve">Matriarch</w:t>
+            </w:r>
+          </w:p>
+        </w:tc>
+        <w:tc>
+          <w:tcPr>
+            <w:tcW w:type="dxa" w:w="2600"/>
+            <w:tcMar>
+              <w:top w:type="dxa" w:w="45"/>
+              <w:left w:type="dxa" w:w="90"/>
+              <w:bottom w:type="dxa" w:w="45"/>
+              <w:right w:type="dxa" w:w="90"/>
+            </w:tcMar>
+            <w:vAlign w:val="top"/>
+          </w:tcPr>
+          <w:p>
+            <w:pPr>
+              <w:spacing w:after="0" w:line="240"/>
+              <w:jc w:val="left"/>
+            </w:pPr>
+            <w:r>
+              <w:rPr>
+                <w:b w:val="false"/>
+                <w:bCs w:val="false"/>
+                <w:sz w:val="15"/>
+                <w:szCs w:val="15"/>
+              </w:rPr>
+              <w:t xml:space="preserve">Strike on a marked spot</w:t>
+            </w:r>
+          </w:p>
+        </w:tc>
+        <w:tc>
+          <w:tcPr>
+            <w:tcW w:type="dxa" w:w="1000"/>
+            <w:tcMar>
+              <w:top w:type="dxa" w:w="45"/>
+              <w:left w:type="dxa" w:w="90"/>
+              <w:bottom w:type="dxa" w:w="45"/>
+              <w:right w:type="dxa" w:w="90"/>
+            </w:tcMar>
+            <w:vAlign w:val="top"/>
+          </w:tcPr>
+          <w:p>
+            <w:pPr>
+              <w:spacing w:after="0" w:line="240"/>
+              <w:jc w:val="center"/>
+            </w:pPr>
+            <w:r>
+              <w:rPr>
+                <w:b w:val="false"/>
+                <w:bCs w:val="false"/>
+                <w:sz w:val="15"/>
+                <w:szCs w:val="15"/>
+              </w:rPr>
+              <w:t xml:space="preserve">18</w:t>
+            </w:r>
+          </w:p>
+        </w:tc>
+        <w:tc>
+          <w:tcPr>
+            <w:tcW w:type="dxa" w:w="1906"/>
+            <w:tcMar>
+              <w:top w:type="dxa" w:w="45"/>
+              <w:left w:type="dxa" w:w="90"/>
+              <w:bottom w:type="dxa" w:w="45"/>
+              <w:right w:type="dxa" w:w="90"/>
+            </w:tcMar>
+            <w:vAlign w:val="top"/>
+          </w:tcPr>
+          <w:p>
+            <w:pPr>
+              <w:spacing w:after="0" w:line="240"/>
+              <w:jc w:val="left"/>
+            </w:pPr>
+            <w:r>
+              <w:rPr>
+                <w:b w:val="false"/>
+                <w:bCs w:val="false"/>
+                <w:sz w:val="15"/>
+                <w:szCs w:val="15"/>
+              </w:rPr>
+              <w:t xml:space="preserve">Neutral, Enraged</w:t>
+            </w:r>
+          </w:p>
+        </w:tc>
+      </w:tr>
+      <w:tr>
+        <w:trPr>
+          <w:cantSplit/>
+        </w:trPr>
+        <w:tc>
+          <w:tcPr>
+            <w:tcW w:type="dxa" w:w="2500"/>
+            <w:tcMar>
+              <w:top w:type="dxa" w:w="45"/>
+              <w:left w:type="dxa" w:w="90"/>
+              <w:bottom w:type="dxa" w:w="45"/>
+              <w:right w:type="dxa" w:w="90"/>
+            </w:tcMar>
+            <w:vAlign w:val="top"/>
+          </w:tcPr>
+          <w:p>
+            <w:pPr>
+              <w:spacing w:after="0" w:line="240"/>
+              <w:jc w:val="left"/>
+            </w:pPr>
+            <w:r>
+              <w:rPr>
+                <w:b/>
+                <w:bCs/>
+                <w:sz w:val="15"/>
+                <w:szCs w:val="15"/>
+              </w:rPr>
+              <w:t xml:space="preserve">Sundering Ring</w:t>
+            </w:r>
+          </w:p>
+        </w:tc>
+        <w:tc>
+          <w:tcPr>
+            <w:tcW w:type="dxa" w:w="1300"/>
+            <w:tcMar>
+              <w:top w:type="dxa" w:w="45"/>
+              <w:left w:type="dxa" w:w="90"/>
+              <w:bottom w:type="dxa" w:w="45"/>
+              <w:right w:type="dxa" w:w="90"/>
+            </w:tcMar>
+            <w:vAlign w:val="top"/>
+          </w:tcPr>
+          <w:p>
+            <w:pPr>
+              <w:spacing w:after="0" w:line="240"/>
+              <w:jc w:val="left"/>
+            </w:pPr>
+            <w:r>
+              <w:rPr>
+                <w:b w:val="false"/>
+                <w:bCs w:val="false"/>
+                <w:sz w:val="15"/>
+                <w:szCs w:val="15"/>
+              </w:rPr>
+              <w:t xml:space="preserve">Matriarch</w:t>
+            </w:r>
+          </w:p>
+        </w:tc>
+        <w:tc>
+          <w:tcPr>
+            <w:tcW w:type="dxa" w:w="2600"/>
+            <w:tcMar>
+              <w:top w:type="dxa" w:w="45"/>
+              <w:left w:type="dxa" w:w="90"/>
+              <w:bottom w:type="dxa" w:w="45"/>
+              <w:right w:type="dxa" w:w="90"/>
+            </w:tcMar>
+            <w:vAlign w:val="top"/>
+          </w:tcPr>
+          <w:p>
+            <w:pPr>
+              <w:spacing w:after="0" w:line="240"/>
+              <w:jc w:val="left"/>
+            </w:pPr>
+            <w:r>
+              <w:rPr>
+                <w:b w:val="false"/>
+                <w:bCs w:val="false"/>
+                <w:sz w:val="15"/>
+                <w:szCs w:val="15"/>
+              </w:rPr>
+              <w:t xml:space="preserve">Wide shockwave</w:t>
+            </w:r>
+          </w:p>
+        </w:tc>
+        <w:tc>
+          <w:tcPr>
+            <w:tcW w:type="dxa" w:w="1000"/>
+            <w:tcMar>
+              <w:top w:type="dxa" w:w="45"/>
+              <w:left w:type="dxa" w:w="90"/>
+              <w:bottom w:type="dxa" w:w="45"/>
+              <w:right w:type="dxa" w:w="90"/>
+            </w:tcMar>
+            <w:vAlign w:val="top"/>
+          </w:tcPr>
+          <w:p>
+            <w:pPr>
+              <w:spacing w:after="0" w:line="240"/>
+              <w:jc w:val="center"/>
+            </w:pPr>
+            <w:r>
+              <w:rPr>
+                <w:b w:val="false"/>
+                <w:bCs w:val="false"/>
+                <w:sz w:val="15"/>
+                <w:szCs w:val="15"/>
+              </w:rPr>
+              <w:t xml:space="preserve">16</w:t>
+            </w:r>
+          </w:p>
+        </w:tc>
+        <w:tc>
+          <w:tcPr>
+            <w:tcW w:type="dxa" w:w="1906"/>
+            <w:tcMar>
+              <w:top w:type="dxa" w:w="45"/>
+              <w:left w:type="dxa" w:w="90"/>
+              <w:bottom w:type="dxa" w:w="45"/>
+              <w:right w:type="dxa" w:w="90"/>
+            </w:tcMar>
+            <w:vAlign w:val="top"/>
+          </w:tcPr>
+          <w:p>
+            <w:pPr>
+              <w:spacing w:after="0" w:line="240"/>
+              <w:jc w:val="left"/>
+            </w:pPr>
+            <w:r>
+              <w:rPr>
+                <w:b w:val="false"/>
+                <w:bCs w:val="false"/>
+                <w:sz w:val="15"/>
+                <w:szCs w:val="15"/>
+              </w:rPr>
+              <w:t xml:space="preserve">Enraged</w:t>
             </w:r>
           </w:p>
         </w:tc>
@@ -7705,7 +8259,7 @@
               <w:jc w:val="both"/>
             </w:pPr>
             <w:r>
-              <w:t xml:space="preserve">Every expedition is graded: one star for bringing the road home, one for bringing every hero back, and one for felling the region’s guardian. Perfectionists will return to earlier regions with a stronger party to fill in every star.</w:t>
+              <w:t xml:space="preserve">Every expedition is graded: one star for bringing the road home, one for bringing every hero back, and one for delivering a Great flask or better. Perfectionists will return to earlier regions with a stronger party and a steadier hand to fill in every star.</w:t>
             </w:r>
           </w:p>
         </w:tc>
@@ -7744,7 +8298,7 @@
                           </pic:cNvPicPr>
                         </pic:nvPicPr>
                         <pic:blipFill>
-                          <a:blip r:embed="rId36" cstate="none"/>
+                          <a:blip r:embed="rId37" cstate="none"/>
                           <a:srcRect/>
                           <a:stretch>
                             <a:fillRect/>
@@ -7809,7 +8363,7 @@
         <w:jc w:val="both"/>
       </w:pPr>
       <w:r>
-        <w:t xml:space="preserve">Diary entries unlock from milestones — the first morning, each region cleared, the first Perfect potion, each rare ingredient discovered — and every one is illustrated. Filling the diary completes the story, and the sketch of the thing at the centre gains a piece for every region the witch pushes back.</w:t>
+        <w:t xml:space="preserve">Eleven illustrated pages unlock as the story moves — the first night, a clue from each region cleared, the first Perfect potion, the Woodwose’s last words, and the ending — and a note slides in whenever one does. Read in order, the pages are enough to guess the twist before the Peak says it aloud.</w:t>
       </w:r>
     </w:p>
     <w:p>
@@ -7895,49 +8449,6 @@
             <wp:extent cx="438150" cy="438150"/>
             <wp:effectExtent t="0" r="0" b="0" l="0"/>
             <wp:docPr id="1" name="herb_nature.png" descr="herb_nature.png" title="herb_nature.png"/>
-            <wp:cNvGraphicFramePr>
-              <a:graphicFrameLocks xmlns:a="http://schemas.openxmlformats.org/drawingml/2006/main" noChangeAspect="1"/>
-            </wp:cNvGraphicFramePr>
-            <a:graphic xmlns:a="http://schemas.openxmlformats.org/drawingml/2006/main">
-              <a:graphicData uri="http://schemas.openxmlformats.org/drawingml/2006/picture">
-                <pic:pic xmlns:pic="http://schemas.openxmlformats.org/drawingml/2006/picture">
-                  <pic:nvPicPr>
-                    <pic:cNvPr id="0" name="" descr=""/>
-                    <pic:cNvPicPr>
-                      <a:picLocks noChangeAspect="1" noChangeArrowheads="1"/>
-                    </pic:cNvPicPr>
-                  </pic:nvPicPr>
-                  <pic:blipFill>
-                    <a:blip r:embed="rId37" cstate="none"/>
-                    <a:srcRect/>
-                    <a:stretch>
-                      <a:fillRect/>
-                    </a:stretch>
-                  </pic:blipFill>
-                  <pic:spPr bwMode="auto">
-                    <a:xfrm>
-                      <a:off x="0" y="0"/>
-                      <a:ext cx="438150" cy="438150"/>
-                    </a:xfrm>
-                    <a:prstGeom prst="rect">
-                      <a:avLst/>
-                    </a:prstGeom>
-                  </pic:spPr>
-                </pic:pic>
-              </a:graphicData>
-            </a:graphic>
-          </wp:inline>
-        </w:drawing>
-      </w:r>
-      <w:r>
-        <w:t xml:space="preserve">    </w:t>
-      </w:r>
-      <w:r>
-        <w:drawing>
-          <wp:inline distT="0" distB="0" distL="0" distR="0">
-            <wp:extent cx="438150" cy="438150"/>
-            <wp:effectExtent t="0" r="0" b="0" l="0"/>
-            <wp:docPr id="1" name="herb_fire.png" descr="herb_fire.png" title="herb_fire.png"/>
             <wp:cNvGraphicFramePr>
               <a:graphicFrameLocks xmlns:a="http://schemas.openxmlformats.org/drawingml/2006/main" noChangeAspect="1"/>
             </wp:cNvGraphicFramePr>
@@ -7980,7 +8491,7 @@
           <wp:inline distT="0" distB="0" distL="0" distR="0">
             <wp:extent cx="438150" cy="438150"/>
             <wp:effectExtent t="0" r="0" b="0" l="0"/>
-            <wp:docPr id="1" name="herb_water.png" descr="herb_water.png" title="herb_water.png"/>
+            <wp:docPr id="1" name="herb_fire.png" descr="herb_fire.png" title="herb_fire.png"/>
             <wp:cNvGraphicFramePr>
               <a:graphicFrameLocks xmlns:a="http://schemas.openxmlformats.org/drawingml/2006/main" noChangeAspect="1"/>
             </wp:cNvGraphicFramePr>
@@ -8023,7 +8534,7 @@
           <wp:inline distT="0" distB="0" distL="0" distR="0">
             <wp:extent cx="438150" cy="438150"/>
             <wp:effectExtent t="0" r="0" b="0" l="0"/>
-            <wp:docPr id="1" name="herb_poison.png" descr="herb_poison.png" title="herb_poison.png"/>
+            <wp:docPr id="1" name="herb_water.png" descr="herb_water.png" title="herb_water.png"/>
             <wp:cNvGraphicFramePr>
               <a:graphicFrameLocks xmlns:a="http://schemas.openxmlformats.org/drawingml/2006/main" noChangeAspect="1"/>
             </wp:cNvGraphicFramePr>
@@ -8066,7 +8577,7 @@
           <wp:inline distT="0" distB="0" distL="0" distR="0">
             <wp:extent cx="438150" cy="438150"/>
             <wp:effectExtent t="0" r="0" b="0" l="0"/>
-            <wp:docPr id="1" name="herb_arcane.png" descr="herb_arcane.png" title="herb_arcane.png"/>
+            <wp:docPr id="1" name="herb_poison.png" descr="herb_poison.png" title="herb_poison.png"/>
             <wp:cNvGraphicFramePr>
               <a:graphicFrameLocks xmlns:a="http://schemas.openxmlformats.org/drawingml/2006/main" noChangeAspect="1"/>
             </wp:cNvGraphicFramePr>
@@ -8101,6 +8612,49 @@
           </wp:inline>
         </w:drawing>
       </w:r>
+      <w:r>
+        <w:t xml:space="preserve">    </w:t>
+      </w:r>
+      <w:r>
+        <w:drawing>
+          <wp:inline distT="0" distB="0" distL="0" distR="0">
+            <wp:extent cx="438150" cy="438150"/>
+            <wp:effectExtent t="0" r="0" b="0" l="0"/>
+            <wp:docPr id="1" name="herb_arcane.png" descr="herb_arcane.png" title="herb_arcane.png"/>
+            <wp:cNvGraphicFramePr>
+              <a:graphicFrameLocks xmlns:a="http://schemas.openxmlformats.org/drawingml/2006/main" noChangeAspect="1"/>
+            </wp:cNvGraphicFramePr>
+            <a:graphic xmlns:a="http://schemas.openxmlformats.org/drawingml/2006/main">
+              <a:graphicData uri="http://schemas.openxmlformats.org/drawingml/2006/picture">
+                <pic:pic xmlns:pic="http://schemas.openxmlformats.org/drawingml/2006/picture">
+                  <pic:nvPicPr>
+                    <pic:cNvPr id="0" name="" descr=""/>
+                    <pic:cNvPicPr>
+                      <a:picLocks noChangeAspect="1" noChangeArrowheads="1"/>
+                    </pic:cNvPicPr>
+                  </pic:nvPicPr>
+                  <pic:blipFill>
+                    <a:blip r:embed="rId42" cstate="none"/>
+                    <a:srcRect/>
+                    <a:stretch>
+                      <a:fillRect/>
+                    </a:stretch>
+                  </pic:blipFill>
+                  <pic:spPr bwMode="auto">
+                    <a:xfrm>
+                      <a:off x="0" y="0"/>
+                      <a:ext cx="438150" cy="438150"/>
+                    </a:xfrm>
+                    <a:prstGeom prst="rect">
+                      <a:avLst/>
+                    </a:prstGeom>
+                  </pic:spPr>
+                </pic:pic>
+              </a:graphicData>
+            </a:graphic>
+          </wp:inline>
+        </w:drawing>
+      </w:r>
     </w:p>
     <w:p>
       <w:pPr>
@@ -9005,7 +9559,7 @@
         <w:jc w:val="both"/>
       </w:pPr>
       <w:r>
-        <w:t xml:space="preserve">Free updates may add new regions, heroes, recipes and chapters of the diary. The ending deliberately leaves room for more: breaking the curse reveals it was a trap set by someone far bigger, and that is a story worth continuing.</w:t>
+        <w:t xml:space="preserve">Free updates may add new regions, heroes, recipes and chapters of the diary. The ending deliberately leaves room for more: the Coven is bigger than one Matriarch, and Sister Veil will be back.</w:t>
       </w:r>
     </w:p>
     <w:p>

</xml_diff>

<commit_message>
docs: the 10-pager's cauldron is the stir band, and its benches are the fixed ones
One phrase on Gestalt and the Cauldron half of the benches bullet on Gameplay
mechanics now describe the band that is the stir itself. The page images are
recomposed from the latest playtest, so the Prep thumbnail shows leaves in the
bowl and the Bottling one a flask with brew in it. Still cover plus nine.
</commit_message>
<xml_diff>
--- a/docs/Alchemists_Arsenal_10-pager.docx
+++ b/docs/Alchemists_Arsenal_10-pager.docx
@@ -4119,7 +4119,7 @@
         <w:t xml:space="preserve">morning is a rush</w:t>
       </w:r>
       <w:r>
-        <w:t xml:space="preserve">: the clock is draining, the heat band is drifting, a customer is waiting and the player’s hands are full. The </w:t>
+        <w:t xml:space="preserve">: the clock is draining, the stir band is drifting, a customer is waiting and the player’s hands are full. The </w:t>
       </w:r>
       <w:r>
         <w:rPr>
@@ -5041,7 +5041,7 @@
         <w:t xml:space="preserve">Cauldron:</w:t>
       </w:r>
       <w:r>
-        <w:t xml:space="preserve"> stir the spoon round the pot the way the recipe turns; the herbs ride the vortex and dissolve, and stirring too hard slops them over the rim. </w:t>
+        <w:t xml:space="preserve"> stir the spoon round the pot the way the recipe turns, and hold that stir inside a band that drifts: the herbs ride the vortex and dissolve, too slow and the brew catches and burns on the bottom, too fast and it slops over the rim, herbs and all. </w:t>
       </w:r>
       <w:r>
         <w:rPr>

</xml_diff>

<commit_message>
docs: the 10-pager covers malting, a flask per hero, the upgrades and the harder later roads
</commit_message>
<xml_diff>
--- a/docs/Alchemists_Arsenal_10-pager.docx
+++ b/docs/Alchemists_Arsenal_10-pager.docx
@@ -516,7 +516,7 @@
           <w:sz w:val="19"/>
           <w:szCs w:val="19"/>
         </w:rPr>
-        <w:t xml:space="preserve">Version 2.0  ·  22 September 2026</w:t>
+        <w:t xml:space="preserve">Version 2.1  ·  23 September 2026</w:t>
       </w:r>
     </w:p>
     <w:p>
@@ -885,7 +885,7 @@
                 <w:sz w:val="17"/>
                 <w:szCs w:val="17"/>
               </w:rPr>
-              <w:t xml:space="preserve">Take one of three jobs at the counter, then race a real-time clock across the Prep bench, the Cauldron and the Bottling table to brew one elemental bomb for every hero going out.</w:t>
+              <w:t xml:space="preserve">Every hero going out comes to the counter and takes one of three jobs. Then race a real-time clock across five benches — malt the grain, grind the leaves, stir the cauldron, bottle the brew — working every hero’s flask side by side.</w:t>
             </w:r>
           </w:p>
         </w:tc>
@@ -1242,7 +1242,7 @@
                 <w:sz w:val="15"/>
                 <w:szCs w:val="15"/>
               </w:rPr>
-              <w:t xml:space="preserve"> — a customer, the scouted road and three jobs to choose from.</w:t>
+              <w:t xml:space="preserve"> — a hero at the counter, the rest of the party queuing behind.</w:t>
             </w:r>
           </w:p>
         </w:tc>
@@ -1414,7 +1414,7 @@
                 <w:sz w:val="15"/>
                 <w:szCs w:val="15"/>
               </w:rPr>
-              <w:t xml:space="preserve"> — the road, the job and the pay, accounted for.</w:t>
+              <w:t xml:space="preserve"> — the road, every hero’s job and the pay, accounted for.</w:t>
             </w:r>
           </w:p>
         </w:tc>
@@ -1792,7 +1792,7 @@
         <w:jc w:val="both"/>
       </w:pPr>
       <w:r>
-        <w:t xml:space="preserve">Adventurers walk in as customers — each with a favourite element they ask for, a fee and a standard they hold the witch to — and she can hire them onto her roster. On the road each is attuned to one element and has their own way of fighting, so choosing who carries which flask is half the game.</w:t>
+        <w:t xml:space="preserve">Adventurers walk in as customers — each with a favourite element, a fee and a standard they hold the witch to — and she can hire them onto her roster. Once hired they come to the counter every morning to order the flask they will carry. On the road each is attuned to one element and has their own way of fighting, so choosing who carries which flask is half the game.</w:t>
       </w:r>
     </w:p>
     <w:tbl>
@@ -2620,24 +2620,1001 @@
     </w:p>
     <w:p>
       <w:pPr>
-        <w:spacing w:after="110" w:before="0" w:line="264"/>
+        <w:spacing w:after="70" w:before="0" w:line="264"/>
         <w:jc w:val="both"/>
       </w:pPr>
       <w:r>
-        <w:t xml:space="preserve">The forest road runs through five regions, each themed on an element and each harder than the last. Earning at least one star on a region opens the next, and the witch can push into at most one new region a day — so the Coven’s Peak is five days away at the very least, and most players will take many more, replaying roads, earning gold and building a party strong enough for the summit.</w:t>
-      </w:r>
+        <w:t xml:space="preserve">The forest road runs through five regions, each themed on an element and each harder than the last. Earning at least one star on a region opens the next, and the witch can push into at most one new region a day — so the Coven’s Peak is five days away at the very least, and most players will take many more. The first two roads can be held by one hero with nothing bought. From the third road on the waves are denser and tougher and bite harder, and a hero who walks it alone with nothing bought cannot hold it — the map says what tomorrow’s road asks for.</w:t>
+      </w:r>
+    </w:p>
+    <w:tbl>
+      <w:tblPr>
+        <w:tblW w:type="dxa" w:w="9306"/>
+        <w:jc w:val="center"/>
+        <w:tblBorders>
+          <w:top w:val="single" w:color="CFC6D6" w:sz="4"/>
+          <w:left w:val="single" w:color="CFC6D6" w:sz="4"/>
+          <w:bottom w:val="single" w:color="CFC6D6" w:sz="4"/>
+          <w:right w:val="single" w:color="CFC6D6" w:sz="4"/>
+          <w:insideH w:val="single" w:color="CFC6D6" w:sz="4"/>
+          <w:insideV w:val="single" w:color="CFC6D6" w:sz="4"/>
+        </w:tblBorders>
+        <w:tblLayout w:type="fixed"/>
+      </w:tblPr>
+      <w:tblGrid>
+        <w:gridCol w:w="420"/>
+        <w:gridCol w:w="1640"/>
+        <w:gridCol w:w="900"/>
+        <w:gridCol w:w="4146"/>
+        <w:gridCol w:w="2200"/>
+      </w:tblGrid>
+      <w:tr>
+        <w:trPr>
+          <w:cantSplit/>
+          <w:tblHeader/>
+        </w:trPr>
+        <w:tc>
+          <w:tcPr>
+            <w:tcW w:type="dxa" w:w="420"/>
+            <w:shd w:fill="EFE9F3" w:color="auto" w:val="clear"/>
+            <w:tcMar>
+              <w:top w:type="dxa" w:w="45"/>
+              <w:left w:type="dxa" w:w="90"/>
+              <w:bottom w:type="dxa" w:w="45"/>
+              <w:right w:type="dxa" w:w="90"/>
+            </w:tcMar>
+            <w:vAlign w:val="top"/>
+          </w:tcPr>
+          <w:p>
+            <w:pPr>
+              <w:spacing w:after="0" w:line="240"/>
+              <w:jc w:val="center"/>
+            </w:pPr>
+            <w:r>
+              <w:rPr>
+                <w:b/>
+                <w:bCs/>
+                <w:sz w:val="15"/>
+                <w:szCs w:val="15"/>
+              </w:rPr>
+              <w:t xml:space="preserve">#</w:t>
+            </w:r>
+          </w:p>
+        </w:tc>
+        <w:tc>
+          <w:tcPr>
+            <w:tcW w:type="dxa" w:w="1640"/>
+            <w:shd w:fill="EFE9F3" w:color="auto" w:val="clear"/>
+            <w:tcMar>
+              <w:top w:type="dxa" w:w="45"/>
+              <w:left w:type="dxa" w:w="90"/>
+              <w:bottom w:type="dxa" w:w="45"/>
+              <w:right w:type="dxa" w:w="90"/>
+            </w:tcMar>
+            <w:vAlign w:val="top"/>
+          </w:tcPr>
+          <w:p>
+            <w:pPr>
+              <w:spacing w:after="0" w:line="240"/>
+              <w:jc w:val="left"/>
+            </w:pPr>
+            <w:r>
+              <w:rPr>
+                <w:b/>
+                <w:bCs/>
+                <w:sz w:val="15"/>
+                <w:szCs w:val="15"/>
+              </w:rPr>
+              <w:t xml:space="preserve">Region</w:t>
+            </w:r>
+          </w:p>
+        </w:tc>
+        <w:tc>
+          <w:tcPr>
+            <w:tcW w:type="dxa" w:w="900"/>
+            <w:shd w:fill="EFE9F3" w:color="auto" w:val="clear"/>
+            <w:tcMar>
+              <w:top w:type="dxa" w:w="45"/>
+              <w:left w:type="dxa" w:w="90"/>
+              <w:bottom w:type="dxa" w:w="45"/>
+              <w:right w:type="dxa" w:w="90"/>
+            </w:tcMar>
+            <w:vAlign w:val="top"/>
+          </w:tcPr>
+          <w:p>
+            <w:pPr>
+              <w:spacing w:after="0" w:line="240"/>
+              <w:jc w:val="left"/>
+            </w:pPr>
+            <w:r>
+              <w:rPr>
+                <w:b/>
+                <w:bCs/>
+                <w:sz w:val="15"/>
+                <w:szCs w:val="15"/>
+              </w:rPr>
+              <w:t xml:space="preserve">Element</w:t>
+            </w:r>
+          </w:p>
+        </w:tc>
+        <w:tc>
+          <w:tcPr>
+            <w:tcW w:type="dxa" w:w="4146"/>
+            <w:shd w:fill="EFE9F3" w:color="auto" w:val="clear"/>
+            <w:tcMar>
+              <w:top w:type="dxa" w:w="45"/>
+              <w:left w:type="dxa" w:w="90"/>
+              <w:bottom w:type="dxa" w:w="45"/>
+              <w:right w:type="dxa" w:w="90"/>
+            </w:tcMar>
+            <w:vAlign w:val="top"/>
+          </w:tcPr>
+          <w:p>
+            <w:pPr>
+              <w:spacing w:after="0" w:line="240"/>
+              <w:jc w:val="left"/>
+            </w:pPr>
+            <w:r>
+              <w:rPr>
+                <w:b/>
+                <w:bCs/>
+                <w:sz w:val="15"/>
+                <w:szCs w:val="15"/>
+              </w:rPr>
+              <w:t xml:space="preserve">What waits there</w:t>
+            </w:r>
+          </w:p>
+        </w:tc>
+        <w:tc>
+          <w:tcPr>
+            <w:tcW w:type="dxa" w:w="2200"/>
+            <w:shd w:fill="EFE9F3" w:color="auto" w:val="clear"/>
+            <w:tcMar>
+              <w:top w:type="dxa" w:w="45"/>
+              <w:left w:type="dxa" w:w="90"/>
+              <w:bottom w:type="dxa" w:w="45"/>
+              <w:right w:type="dxa" w:w="90"/>
+            </w:tcMar>
+            <w:vAlign w:val="top"/>
+          </w:tcPr>
+          <w:p>
+            <w:pPr>
+              <w:spacing w:after="0" w:line="240"/>
+              <w:jc w:val="left"/>
+            </w:pPr>
+            <w:r>
+              <w:rPr>
+                <w:b/>
+                <w:bCs/>
+                <w:sz w:val="15"/>
+                <w:szCs w:val="15"/>
+              </w:rPr>
+              <w:t xml:space="preserve">What it asks for</w:t>
+            </w:r>
+          </w:p>
+        </w:tc>
+      </w:tr>
+      <w:tr>
+        <w:trPr>
+          <w:cantSplit/>
+        </w:trPr>
+        <w:tc>
+          <w:tcPr>
+            <w:tcW w:type="dxa" w:w="420"/>
+            <w:tcMar>
+              <w:top w:type="dxa" w:w="45"/>
+              <w:left w:type="dxa" w:w="90"/>
+              <w:bottom w:type="dxa" w:w="45"/>
+              <w:right w:type="dxa" w:w="90"/>
+            </w:tcMar>
+            <w:vAlign w:val="top"/>
+          </w:tcPr>
+          <w:p>
+            <w:pPr>
+              <w:spacing w:after="0" w:line="240"/>
+              <w:jc w:val="center"/>
+            </w:pPr>
+            <w:r>
+              <w:rPr>
+                <w:b w:val="false"/>
+                <w:bCs w:val="false"/>
+                <w:sz w:val="15"/>
+                <w:szCs w:val="15"/>
+              </w:rPr>
+              <w:t xml:space="preserve">1</w:t>
+            </w:r>
+          </w:p>
+        </w:tc>
+        <w:tc>
+          <w:tcPr>
+            <w:tcW w:type="dxa" w:w="1640"/>
+            <w:tcMar>
+              <w:top w:type="dxa" w:w="45"/>
+              <w:left w:type="dxa" w:w="90"/>
+              <w:bottom w:type="dxa" w:w="45"/>
+              <w:right w:type="dxa" w:w="90"/>
+            </w:tcMar>
+            <w:vAlign w:val="top"/>
+          </w:tcPr>
+          <w:p>
+            <w:pPr>
+              <w:spacing w:after="0" w:line="240"/>
+              <w:jc w:val="left"/>
+            </w:pPr>
+            <w:r>
+              <w:rPr>
+                <w:b w:val="false"/>
+                <w:bCs w:val="false"/>
+                <w:sz w:val="15"/>
+                <w:szCs w:val="15"/>
+              </w:rPr>
+              <w:t xml:space="preserve">Whispering Woods</w:t>
+            </w:r>
+          </w:p>
+        </w:tc>
+        <w:tc>
+          <w:tcPr>
+            <w:tcW w:type="dxa" w:w="900"/>
+            <w:tcMar>
+              <w:top w:type="dxa" w:w="45"/>
+              <w:left w:type="dxa" w:w="90"/>
+              <w:bottom w:type="dxa" w:w="45"/>
+              <w:right w:type="dxa" w:w="90"/>
+            </w:tcMar>
+            <w:vAlign w:val="top"/>
+          </w:tcPr>
+          <w:p>
+            <w:pPr>
+              <w:spacing w:after="0" w:line="240"/>
+              <w:jc w:val="left"/>
+            </w:pPr>
+            <w:r>
+              <w:rPr>
+                <w:b w:val="false"/>
+                <w:bCs w:val="false"/>
+                <w:sz w:val="15"/>
+                <w:szCs w:val="15"/>
+              </w:rPr>
+              <w:t xml:space="preserve">Nature</w:t>
+            </w:r>
+          </w:p>
+        </w:tc>
+        <w:tc>
+          <w:tcPr>
+            <w:tcW w:type="dxa" w:w="4146"/>
+            <w:tcMar>
+              <w:top w:type="dxa" w:w="45"/>
+              <w:left w:type="dxa" w:w="90"/>
+              <w:bottom w:type="dxa" w:w="45"/>
+              <w:right w:type="dxa" w:w="90"/>
+            </w:tcMar>
+            <w:vAlign w:val="top"/>
+          </w:tcPr>
+          <w:p>
+            <w:pPr>
+              <w:spacing w:after="0" w:line="240"/>
+              <w:jc w:val="left"/>
+            </w:pPr>
+            <w:r>
+              <w:rPr>
+                <w:b w:val="false"/>
+                <w:bCs w:val="false"/>
+                <w:sz w:val="15"/>
+                <w:szCs w:val="15"/>
+              </w:rPr>
+              <w:t xml:space="preserve">Bark Treants, Thornlings and a Water wave of Mossbacks; the Elder Woodwose, once it is cleared.</w:t>
+            </w:r>
+          </w:p>
+        </w:tc>
+        <w:tc>
+          <w:tcPr>
+            <w:tcW w:type="dxa" w:w="2200"/>
+            <w:tcMar>
+              <w:top w:type="dxa" w:w="45"/>
+              <w:left w:type="dxa" w:w="90"/>
+              <w:bottom w:type="dxa" w:w="45"/>
+              <w:right w:type="dxa" w:w="90"/>
+            </w:tcMar>
+            <w:vAlign w:val="top"/>
+          </w:tcPr>
+          <w:p>
+            <w:pPr>
+              <w:spacing w:after="0" w:line="240"/>
+              <w:jc w:val="left"/>
+            </w:pPr>
+            <w:r>
+              <w:rPr>
+                <w:b w:val="false"/>
+                <w:bCs w:val="false"/>
+                <w:sz w:val="15"/>
+                <w:szCs w:val="15"/>
+              </w:rPr>
+              <w:t xml:space="preserve">One hero, nothing bought</w:t>
+            </w:r>
+          </w:p>
+        </w:tc>
+      </w:tr>
+      <w:tr>
+        <w:trPr>
+          <w:cantSplit/>
+        </w:trPr>
+        <w:tc>
+          <w:tcPr>
+            <w:tcW w:type="dxa" w:w="420"/>
+            <w:tcMar>
+              <w:top w:type="dxa" w:w="45"/>
+              <w:left w:type="dxa" w:w="90"/>
+              <w:bottom w:type="dxa" w:w="45"/>
+              <w:right w:type="dxa" w:w="90"/>
+            </w:tcMar>
+            <w:vAlign w:val="top"/>
+          </w:tcPr>
+          <w:p>
+            <w:pPr>
+              <w:spacing w:after="0" w:line="240"/>
+              <w:jc w:val="center"/>
+            </w:pPr>
+            <w:r>
+              <w:rPr>
+                <w:b w:val="false"/>
+                <w:bCs w:val="false"/>
+                <w:sz w:val="15"/>
+                <w:szCs w:val="15"/>
+              </w:rPr>
+              <w:t xml:space="preserve">2</w:t>
+            </w:r>
+          </w:p>
+        </w:tc>
+        <w:tc>
+          <w:tcPr>
+            <w:tcW w:type="dxa" w:w="1640"/>
+            <w:tcMar>
+              <w:top w:type="dxa" w:w="45"/>
+              <w:left w:type="dxa" w:w="90"/>
+              <w:bottom w:type="dxa" w:w="45"/>
+              <w:right w:type="dxa" w:w="90"/>
+            </w:tcMar>
+            <w:vAlign w:val="top"/>
+          </w:tcPr>
+          <w:p>
+            <w:pPr>
+              <w:spacing w:after="0" w:line="240"/>
+              <w:jc w:val="left"/>
+            </w:pPr>
+            <w:r>
+              <w:rPr>
+                <w:b w:val="false"/>
+                <w:bCs w:val="false"/>
+                <w:sz w:val="15"/>
+                <w:szCs w:val="15"/>
+              </w:rPr>
+              <w:t xml:space="preserve">Cinder Peaks</w:t>
+            </w:r>
+          </w:p>
+        </w:tc>
+        <w:tc>
+          <w:tcPr>
+            <w:tcW w:type="dxa" w:w="900"/>
+            <w:tcMar>
+              <w:top w:type="dxa" w:w="45"/>
+              <w:left w:type="dxa" w:w="90"/>
+              <w:bottom w:type="dxa" w:w="45"/>
+              <w:right w:type="dxa" w:w="90"/>
+            </w:tcMar>
+            <w:vAlign w:val="top"/>
+          </w:tcPr>
+          <w:p>
+            <w:pPr>
+              <w:spacing w:after="0" w:line="240"/>
+              <w:jc w:val="left"/>
+            </w:pPr>
+            <w:r>
+              <w:rPr>
+                <w:b w:val="false"/>
+                <w:bCs w:val="false"/>
+                <w:sz w:val="15"/>
+                <w:szCs w:val="15"/>
+              </w:rPr>
+              <w:t xml:space="preserve">Fire</w:t>
+            </w:r>
+          </w:p>
+        </w:tc>
+        <w:tc>
+          <w:tcPr>
+            <w:tcW w:type="dxa" w:w="4146"/>
+            <w:tcMar>
+              <w:top w:type="dxa" w:w="45"/>
+              <w:left w:type="dxa" w:w="90"/>
+              <w:bottom w:type="dxa" w:w="45"/>
+              <w:right w:type="dxa" w:w="90"/>
+            </w:tcMar>
+            <w:vAlign w:val="top"/>
+          </w:tcPr>
+          <w:p>
+            <w:pPr>
+              <w:spacing w:after="0" w:line="240"/>
+              <w:jc w:val="left"/>
+            </w:pPr>
+            <w:r>
+              <w:rPr>
+                <w:b w:val="false"/>
+                <w:bCs w:val="false"/>
+                <w:sz w:val="15"/>
+                <w:szCs w:val="15"/>
+              </w:rPr>
+              <w:t xml:space="preserve">Emberling packs and Cinder Hounds, the fastest creatures in the forest.</w:t>
+            </w:r>
+          </w:p>
+        </w:tc>
+        <w:tc>
+          <w:tcPr>
+            <w:tcW w:type="dxa" w:w="2200"/>
+            <w:tcMar>
+              <w:top w:type="dxa" w:w="45"/>
+              <w:left w:type="dxa" w:w="90"/>
+              <w:bottom w:type="dxa" w:w="45"/>
+              <w:right w:type="dxa" w:w="90"/>
+            </w:tcMar>
+            <w:vAlign w:val="top"/>
+          </w:tcPr>
+          <w:p>
+            <w:pPr>
+              <w:spacing w:after="0" w:line="240"/>
+              <w:jc w:val="left"/>
+            </w:pPr>
+            <w:r>
+              <w:rPr>
+                <w:b w:val="false"/>
+                <w:bCs w:val="false"/>
+                <w:sz w:val="15"/>
+                <w:szCs w:val="15"/>
+              </w:rPr>
+              <w:t xml:space="preserve">One hero, nothing bought</w:t>
+            </w:r>
+          </w:p>
+        </w:tc>
+      </w:tr>
+      <w:tr>
+        <w:trPr>
+          <w:cantSplit/>
+        </w:trPr>
+        <w:tc>
+          <w:tcPr>
+            <w:tcW w:type="dxa" w:w="420"/>
+            <w:tcMar>
+              <w:top w:type="dxa" w:w="45"/>
+              <w:left w:type="dxa" w:w="90"/>
+              <w:bottom w:type="dxa" w:w="45"/>
+              <w:right w:type="dxa" w:w="90"/>
+            </w:tcMar>
+            <w:vAlign w:val="top"/>
+          </w:tcPr>
+          <w:p>
+            <w:pPr>
+              <w:spacing w:after="0" w:line="240"/>
+              <w:jc w:val="center"/>
+            </w:pPr>
+            <w:r>
+              <w:rPr>
+                <w:b w:val="false"/>
+                <w:bCs w:val="false"/>
+                <w:sz w:val="15"/>
+                <w:szCs w:val="15"/>
+              </w:rPr>
+              <w:t xml:space="preserve">3</w:t>
+            </w:r>
+          </w:p>
+        </w:tc>
+        <w:tc>
+          <w:tcPr>
+            <w:tcW w:type="dxa" w:w="1640"/>
+            <w:tcMar>
+              <w:top w:type="dxa" w:w="45"/>
+              <w:left w:type="dxa" w:w="90"/>
+              <w:bottom w:type="dxa" w:w="45"/>
+              <w:right w:type="dxa" w:w="90"/>
+            </w:tcMar>
+            <w:vAlign w:val="top"/>
+          </w:tcPr>
+          <w:p>
+            <w:pPr>
+              <w:spacing w:after="0" w:line="240"/>
+              <w:jc w:val="left"/>
+            </w:pPr>
+            <w:r>
+              <w:rPr>
+                <w:b w:val="false"/>
+                <w:bCs w:val="false"/>
+                <w:sz w:val="15"/>
+                <w:szCs w:val="15"/>
+              </w:rPr>
+              <w:t xml:space="preserve">Frostbite Caverns</w:t>
+            </w:r>
+          </w:p>
+        </w:tc>
+        <w:tc>
+          <w:tcPr>
+            <w:tcW w:type="dxa" w:w="900"/>
+            <w:tcMar>
+              <w:top w:type="dxa" w:w="45"/>
+              <w:left w:type="dxa" w:w="90"/>
+              <w:bottom w:type="dxa" w:w="45"/>
+              <w:right w:type="dxa" w:w="90"/>
+            </w:tcMar>
+            <w:vAlign w:val="top"/>
+          </w:tcPr>
+          <w:p>
+            <w:pPr>
+              <w:spacing w:after="0" w:line="240"/>
+              <w:jc w:val="left"/>
+            </w:pPr>
+            <w:r>
+              <w:rPr>
+                <w:b w:val="false"/>
+                <w:bCs w:val="false"/>
+                <w:sz w:val="15"/>
+                <w:szCs w:val="15"/>
+              </w:rPr>
+              <w:t xml:space="preserve">Water</w:t>
+            </w:r>
+          </w:p>
+        </w:tc>
+        <w:tc>
+          <w:tcPr>
+            <w:tcW w:type="dxa" w:w="4146"/>
+            <w:tcMar>
+              <w:top w:type="dxa" w:w="45"/>
+              <w:left w:type="dxa" w:w="90"/>
+              <w:bottom w:type="dxa" w:w="45"/>
+              <w:right w:type="dxa" w:w="90"/>
+            </w:tcMar>
+            <w:vAlign w:val="top"/>
+          </w:tcPr>
+          <w:p>
+            <w:pPr>
+              <w:spacing w:after="0" w:line="240"/>
+              <w:jc w:val="left"/>
+            </w:pPr>
+            <w:r>
+              <w:rPr>
+                <w:b w:val="false"/>
+                <w:bCs w:val="false"/>
+                <w:sz w:val="15"/>
+                <w:szCs w:val="15"/>
+              </w:rPr>
+              <w:t xml:space="preserve">Swarming Frostkin, Rimebeasts, an Arcane wave of Rime Wraiths and Frost Trolls.</w:t>
+            </w:r>
+          </w:p>
+        </w:tc>
+        <w:tc>
+          <w:tcPr>
+            <w:tcW w:type="dxa" w:w="2200"/>
+            <w:tcMar>
+              <w:top w:type="dxa" w:w="45"/>
+              <w:left w:type="dxa" w:w="90"/>
+              <w:bottom w:type="dxa" w:w="45"/>
+              <w:right w:type="dxa" w:w="90"/>
+            </w:tcMar>
+            <w:vAlign w:val="top"/>
+          </w:tcPr>
+          <w:p>
+            <w:pPr>
+              <w:spacing w:after="0" w:line="240"/>
+              <w:jc w:val="left"/>
+            </w:pPr>
+            <w:r>
+              <w:rPr>
+                <w:b w:val="false"/>
+                <w:bCs w:val="false"/>
+                <w:sz w:val="15"/>
+                <w:szCs w:val="15"/>
+              </w:rPr>
+              <w:t xml:space="preserve">Two heroes, the first road upgrades</w:t>
+            </w:r>
+          </w:p>
+        </w:tc>
+      </w:tr>
+      <w:tr>
+        <w:trPr>
+          <w:cantSplit/>
+        </w:trPr>
+        <w:tc>
+          <w:tcPr>
+            <w:tcW w:type="dxa" w:w="420"/>
+            <w:tcMar>
+              <w:top w:type="dxa" w:w="45"/>
+              <w:left w:type="dxa" w:w="90"/>
+              <w:bottom w:type="dxa" w:w="45"/>
+              <w:right w:type="dxa" w:w="90"/>
+            </w:tcMar>
+            <w:vAlign w:val="top"/>
+          </w:tcPr>
+          <w:p>
+            <w:pPr>
+              <w:spacing w:after="0" w:line="240"/>
+              <w:jc w:val="center"/>
+            </w:pPr>
+            <w:r>
+              <w:rPr>
+                <w:b w:val="false"/>
+                <w:bCs w:val="false"/>
+                <w:sz w:val="15"/>
+                <w:szCs w:val="15"/>
+              </w:rPr>
+              <w:t xml:space="preserve">4</w:t>
+            </w:r>
+          </w:p>
+        </w:tc>
+        <w:tc>
+          <w:tcPr>
+            <w:tcW w:type="dxa" w:w="1640"/>
+            <w:tcMar>
+              <w:top w:type="dxa" w:w="45"/>
+              <w:left w:type="dxa" w:w="90"/>
+              <w:bottom w:type="dxa" w:w="45"/>
+              <w:right w:type="dxa" w:w="90"/>
+            </w:tcMar>
+            <w:vAlign w:val="top"/>
+          </w:tcPr>
+          <w:p>
+            <w:pPr>
+              <w:spacing w:after="0" w:line="240"/>
+              <w:jc w:val="left"/>
+            </w:pPr>
+            <w:r>
+              <w:rPr>
+                <w:b w:val="false"/>
+                <w:bCs w:val="false"/>
+                <w:sz w:val="15"/>
+                <w:szCs w:val="15"/>
+              </w:rPr>
+              <w:t xml:space="preserve">Venom Swamp</w:t>
+            </w:r>
+          </w:p>
+        </w:tc>
+        <w:tc>
+          <w:tcPr>
+            <w:tcW w:type="dxa" w:w="900"/>
+            <w:tcMar>
+              <w:top w:type="dxa" w:w="45"/>
+              <w:left w:type="dxa" w:w="90"/>
+              <w:bottom w:type="dxa" w:w="45"/>
+              <w:right w:type="dxa" w:w="90"/>
+            </w:tcMar>
+            <w:vAlign w:val="top"/>
+          </w:tcPr>
+          <w:p>
+            <w:pPr>
+              <w:spacing w:after="0" w:line="240"/>
+              <w:jc w:val="left"/>
+            </w:pPr>
+            <w:r>
+              <w:rPr>
+                <w:b w:val="false"/>
+                <w:bCs w:val="false"/>
+                <w:sz w:val="15"/>
+                <w:szCs w:val="15"/>
+              </w:rPr>
+              <w:t xml:space="preserve">Poison</w:t>
+            </w:r>
+          </w:p>
+        </w:tc>
+        <w:tc>
+          <w:tcPr>
+            <w:tcW w:type="dxa" w:w="4146"/>
+            <w:tcMar>
+              <w:top w:type="dxa" w:w="45"/>
+              <w:left w:type="dxa" w:w="90"/>
+              <w:bottom w:type="dxa" w:w="45"/>
+              <w:right w:type="dxa" w:w="90"/>
+            </w:tcMar>
+            <w:vAlign w:val="top"/>
+          </w:tcPr>
+          <w:p>
+            <w:pPr>
+              <w:spacing w:after="0" w:line="240"/>
+              <w:jc w:val="left"/>
+            </w:pPr>
+            <w:r>
+              <w:rPr>
+                <w:b w:val="false"/>
+                <w:bCs w:val="false"/>
+                <w:sz w:val="15"/>
+                <w:szCs w:val="15"/>
+              </w:rPr>
+              <w:t xml:space="preserve">Miremaws, Bog Treants, darting Mire Leeches, Bog Brutes and Blight Maws.</w:t>
+            </w:r>
+          </w:p>
+        </w:tc>
+        <w:tc>
+          <w:tcPr>
+            <w:tcW w:type="dxa" w:w="2200"/>
+            <w:tcMar>
+              <w:top w:type="dxa" w:w="45"/>
+              <w:left w:type="dxa" w:w="90"/>
+              <w:bottom w:type="dxa" w:w="45"/>
+              <w:right w:type="dxa" w:w="90"/>
+            </w:tcMar>
+            <w:vAlign w:val="top"/>
+          </w:tcPr>
+          <w:p>
+            <w:pPr>
+              <w:spacing w:after="0" w:line="240"/>
+              <w:jc w:val="left"/>
+            </w:pPr>
+            <w:r>
+              <w:rPr>
+                <w:b w:val="false"/>
+                <w:bCs w:val="false"/>
+                <w:sz w:val="15"/>
+                <w:szCs w:val="15"/>
+              </w:rPr>
+              <w:t xml:space="preserve">Three heroes, the first road upgrades</w:t>
+            </w:r>
+          </w:p>
+        </w:tc>
+      </w:tr>
+      <w:tr>
+        <w:trPr>
+          <w:cantSplit/>
+        </w:trPr>
+        <w:tc>
+          <w:tcPr>
+            <w:tcW w:type="dxa" w:w="420"/>
+            <w:tcMar>
+              <w:top w:type="dxa" w:w="45"/>
+              <w:left w:type="dxa" w:w="90"/>
+              <w:bottom w:type="dxa" w:w="45"/>
+              <w:right w:type="dxa" w:w="90"/>
+            </w:tcMar>
+            <w:vAlign w:val="top"/>
+          </w:tcPr>
+          <w:p>
+            <w:pPr>
+              <w:spacing w:after="0" w:line="240"/>
+              <w:jc w:val="center"/>
+            </w:pPr>
+            <w:r>
+              <w:rPr>
+                <w:b w:val="false"/>
+                <w:bCs w:val="false"/>
+                <w:sz w:val="15"/>
+                <w:szCs w:val="15"/>
+              </w:rPr>
+              <w:t xml:space="preserve">5</w:t>
+            </w:r>
+          </w:p>
+        </w:tc>
+        <w:tc>
+          <w:tcPr>
+            <w:tcW w:type="dxa" w:w="1640"/>
+            <w:tcMar>
+              <w:top w:type="dxa" w:w="45"/>
+              <w:left w:type="dxa" w:w="90"/>
+              <w:bottom w:type="dxa" w:w="45"/>
+              <w:right w:type="dxa" w:w="90"/>
+            </w:tcMar>
+            <w:vAlign w:val="top"/>
+          </w:tcPr>
+          <w:p>
+            <w:pPr>
+              <w:spacing w:after="0" w:line="240"/>
+              <w:jc w:val="left"/>
+            </w:pPr>
+            <w:r>
+              <w:rPr>
+                <w:b w:val="false"/>
+                <w:bCs w:val="false"/>
+                <w:sz w:val="15"/>
+                <w:szCs w:val="15"/>
+              </w:rPr>
+              <w:t xml:space="preserve">The Coven’s Peak</w:t>
+            </w:r>
+          </w:p>
+        </w:tc>
+        <w:tc>
+          <w:tcPr>
+            <w:tcW w:type="dxa" w:w="900"/>
+            <w:tcMar>
+              <w:top w:type="dxa" w:w="45"/>
+              <w:left w:type="dxa" w:w="90"/>
+              <w:bottom w:type="dxa" w:w="45"/>
+              <w:right w:type="dxa" w:w="90"/>
+            </w:tcMar>
+            <w:vAlign w:val="top"/>
+          </w:tcPr>
+          <w:p>
+            <w:pPr>
+              <w:spacing w:after="0" w:line="240"/>
+              <w:jc w:val="left"/>
+            </w:pPr>
+            <w:r>
+              <w:rPr>
+                <w:b w:val="false"/>
+                <w:bCs w:val="false"/>
+                <w:sz w:val="15"/>
+                <w:szCs w:val="15"/>
+              </w:rPr>
+              <w:t xml:space="preserve">Arcane</w:t>
+            </w:r>
+          </w:p>
+        </w:tc>
+        <w:tc>
+          <w:tcPr>
+            <w:tcW w:type="dxa" w:w="4146"/>
+            <w:tcMar>
+              <w:top w:type="dxa" w:w="45"/>
+              <w:left w:type="dxa" w:w="90"/>
+              <w:bottom w:type="dxa" w:w="45"/>
+              <w:right w:type="dxa" w:w="90"/>
+            </w:tcMar>
+            <w:vAlign w:val="top"/>
+          </w:tcPr>
+          <w:p>
+            <w:pPr>
+              <w:spacing w:after="0" w:line="240"/>
+              <w:jc w:val="left"/>
+            </w:pPr>
+            <w:r>
+              <w:rPr>
+                <w:b w:val="false"/>
+                <w:bCs w:val="false"/>
+                <w:sz w:val="15"/>
+                <w:szCs w:val="15"/>
+              </w:rPr>
+              <w:t xml:space="preserve">Coven Acolytes, Warded Effigies, Hexlings, Wardens — and the Coven Matriarch herself.</w:t>
+            </w:r>
+          </w:p>
+        </w:tc>
+        <w:tc>
+          <w:tcPr>
+            <w:tcW w:type="dxa" w:w="2200"/>
+            <w:tcMar>
+              <w:top w:type="dxa" w:w="45"/>
+              <w:left w:type="dxa" w:w="90"/>
+              <w:bottom w:type="dxa" w:w="45"/>
+              <w:right w:type="dxa" w:w="90"/>
+            </w:tcMar>
+            <w:vAlign w:val="top"/>
+          </w:tcPr>
+          <w:p>
+            <w:pPr>
+              <w:spacing w:after="0" w:line="240"/>
+              <w:jc w:val="left"/>
+            </w:pPr>
+            <w:r>
+              <w:rPr>
+                <w:b w:val="false"/>
+                <w:bCs w:val="false"/>
+                <w:sz w:val="15"/>
+                <w:szCs w:val="15"/>
+              </w:rPr>
+              <w:t xml:space="preserve">Three heroes, every road upgrade</w:t>
+            </w:r>
+          </w:p>
+        </w:tc>
+      </w:tr>
+    </w:tbl>
+    <w:p>
+      <w:pPr>
+        <w:spacing w:after="40"/>
+      </w:pPr>
     </w:p>
     <w:p>
       <w:pPr>
-        <w:spacing w:after="20" w:before="20"/>
+        <w:keepNext/>
+        <w:spacing w:after="60" w:before="0" w:line="264"/>
+        <w:jc w:val="both"/>
+      </w:pPr>
+      <w:r>
+        <w:t xml:space="preserve">Power grows in four ways, and the later roads are tuned so that a witch who skips them cannot pass:</w:t>
+      </w:r>
+    </w:p>
+    <w:p>
+      <w:pPr>
+        <w:pStyle w:val="ListParagraph"/>
+        <w:numPr>
+          <w:ilvl w:val="0"/>
+          <w:numId w:val="2"/>
+        </w:numPr>
+        <w:spacing w:after="55" w:line="252"/>
+        <w:jc w:val="left"/>
+      </w:pPr>
+      <w:r>
+        <w:rPr>
+          <w:b/>
+          <w:bCs/>
+        </w:rPr>
+        <w:t xml:space="preserve">Better brewing.</w:t>
+      </w:r>
+      <w:r>
+        <w:t xml:space="preserve"> The recipe book grows as regions fall — quick two-step brews, balanced classics and five-step </w:t>
+      </w:r>
+      <w:r>
+        <w:rPr>
+          <w:i/>
+          <w:iCs/>
+        </w:rPr>
+        <w:t xml:space="preserve">deep</w:t>
+      </w:r>
+      <w:r>
+        <w:t xml:space="preserve"> recipes that hit far harder but eat the morning clock.</w:t>
+      </w:r>
+    </w:p>
+    <w:p>
+      <w:pPr>
+        <w:pStyle w:val="ListParagraph"/>
+        <w:numPr>
+          <w:ilvl w:val="0"/>
+          <w:numId w:val="2"/>
+        </w:numPr>
+        <w:spacing w:after="55" w:line="252"/>
+        <w:jc w:val="left"/>
+      </w:pPr>
+      <w:r>
+        <w:rPr>
+          <w:b/>
+          <w:bCs/>
+        </w:rPr>
+        <w:t xml:space="preserve">More heroes.</w:t>
+      </w:r>
+      <w:r>
+        <w:t xml:space="preserve"> Hiring is all it takes: a new hero (150, 240, 330, 420 gold) comes to the counter the next morning and orders their own flask, up to four on the road. Each levels from 1 to 5 (45, 80, 140, 240 gold), deliberately modestly: matching hero to flask matters more than grinding.</w:t>
+      </w:r>
+    </w:p>
+    <w:p>
+      <w:pPr>
+        <w:pStyle w:val="ListParagraph"/>
+        <w:numPr>
+          <w:ilvl w:val="0"/>
+          <w:numId w:val="2"/>
+        </w:numPr>
+        <w:spacing w:after="55" w:line="252"/>
+        <w:jc w:val="left"/>
+      </w:pPr>
+      <w:r>
+        <w:rPr>
+          <w:b/>
+          <w:bCs/>
+        </w:rPr>
+        <w:t xml:space="preserve">Road upgrades.</w:t>
+      </w:r>
+      <w:r>
+        <w:t xml:space="preserve"> Heavier flasks, spare vials, thick boots and quick hands — then a second tier of tempered glass, a bandolier and hardened leathers.</w:t>
+      </w:r>
+    </w:p>
+    <w:p>
+      <w:pPr>
+        <w:pStyle w:val="ListParagraph"/>
+        <w:numPr>
+          <w:ilvl w:val="0"/>
+          <w:numId w:val="2"/>
+        </w:numPr>
+        <w:spacing w:after="30" w:line="252"/>
+        <w:jc w:val="left"/>
+      </w:pPr>
+      <w:r>
+        <w:rPr>
+          <w:b/>
+          <w:bCs/>
+        </w:rPr>
+        <w:t xml:space="preserve">Bench upgrades.</w:t>
+      </w:r>
+      <w:r>
+        <w:t xml:space="preserve"> A clockwork stirrer, a draught kiln, a steeping vat, a drying rack, a brass mortar and a glass funnel. Each rebuilds its bench — it looks different the next morning — and several let a bench carry on alone, which is what makes a whole party’s morning manageable.</w:t>
+      </w:r>
+    </w:p>
+    <w:p>
+      <w:pPr>
+        <w:spacing w:after="10" w:before="10"/>
         <w:jc w:val="center"/>
       </w:pPr>
       <w:r>
         <w:drawing>
           <wp:inline distT="0" distB="0" distL="0" distR="0">
-            <wp:extent cx="4095750" cy="1495425"/>
+            <wp:extent cx="4191000" cy="1990725"/>
             <wp:effectExtent t="0" r="0" b="0" l="0"/>
-            <wp:docPr id="1" name="world_road.png" descr="The forest road map with the five regions" title="The forest road map with the five regions"/>
+            <wp:docPr id="1" name="upgrades.png" descr="Three benches before and after their upgrades" title="Three benches before and after their upgrades"/>
             <wp:cNvGraphicFramePr>
               <a:graphicFrameLocks xmlns:a="http://schemas.openxmlformats.org/drawingml/2006/main" noChangeAspect="1"/>
             </wp:cNvGraphicFramePr>
@@ -2660,7 +3637,7 @@
                   <pic:spPr bwMode="auto">
                     <a:xfrm>
                       <a:off x="0" y="0"/>
-                      <a:ext cx="4095750" cy="1495425"/>
+                      <a:ext cx="4191000" cy="1990725"/>
                     </a:xfrm>
                     <a:prstGeom prst="rect">
                       <a:avLst/>
@@ -2686,726 +3663,17 @@
           <w:sz w:val="15"/>
           <w:szCs w:val="15"/>
         </w:rPr>
-        <w:t xml:space="preserve">The forest road after day one: the Whispering Woods cleared with three stars, Cinder Peaks next.</w:t>
-      </w:r>
-    </w:p>
-    <w:tbl>
-      <w:tblPr>
-        <w:tblW w:type="dxa" w:w="9306"/>
-        <w:jc w:val="center"/>
-        <w:tblBorders>
-          <w:top w:val="single" w:color="CFC6D6" w:sz="4"/>
-          <w:left w:val="single" w:color="CFC6D6" w:sz="4"/>
-          <w:bottom w:val="single" w:color="CFC6D6" w:sz="4"/>
-          <w:right w:val="single" w:color="CFC6D6" w:sz="4"/>
-          <w:insideH w:val="single" w:color="CFC6D6" w:sz="4"/>
-          <w:insideV w:val="single" w:color="CFC6D6" w:sz="4"/>
-        </w:tblBorders>
-        <w:tblLayout w:type="fixed"/>
-      </w:tblPr>
-      <w:tblGrid>
-        <w:gridCol w:w="450"/>
-        <w:gridCol w:w="1850"/>
-        <w:gridCol w:w="1050"/>
-        <w:gridCol w:w="5956"/>
-      </w:tblGrid>
-      <w:tr>
-        <w:trPr>
-          <w:cantSplit/>
-          <w:tblHeader/>
-        </w:trPr>
-        <w:tc>
-          <w:tcPr>
-            <w:tcW w:type="dxa" w:w="450"/>
-            <w:shd w:fill="EFE9F3" w:color="auto" w:val="clear"/>
-            <w:tcMar>
-              <w:top w:type="dxa" w:w="45"/>
-              <w:left w:type="dxa" w:w="90"/>
-              <w:bottom w:type="dxa" w:w="45"/>
-              <w:right w:type="dxa" w:w="90"/>
-            </w:tcMar>
-            <w:vAlign w:val="top"/>
-          </w:tcPr>
-          <w:p>
-            <w:pPr>
-              <w:spacing w:after="0" w:line="240"/>
-              <w:jc w:val="center"/>
-            </w:pPr>
-            <w:r>
-              <w:rPr>
-                <w:b/>
-                <w:bCs/>
-                <w:sz w:val="16"/>
-                <w:szCs w:val="16"/>
-              </w:rPr>
-              <w:t xml:space="preserve">#</w:t>
-            </w:r>
-          </w:p>
-        </w:tc>
-        <w:tc>
-          <w:tcPr>
-            <w:tcW w:type="dxa" w:w="1850"/>
-            <w:shd w:fill="EFE9F3" w:color="auto" w:val="clear"/>
-            <w:tcMar>
-              <w:top w:type="dxa" w:w="45"/>
-              <w:left w:type="dxa" w:w="90"/>
-              <w:bottom w:type="dxa" w:w="45"/>
-              <w:right w:type="dxa" w:w="90"/>
-            </w:tcMar>
-            <w:vAlign w:val="top"/>
-          </w:tcPr>
-          <w:p>
-            <w:pPr>
-              <w:spacing w:after="0" w:line="240"/>
-              <w:jc w:val="left"/>
-            </w:pPr>
-            <w:r>
-              <w:rPr>
-                <w:b/>
-                <w:bCs/>
-                <w:sz w:val="16"/>
-                <w:szCs w:val="16"/>
-              </w:rPr>
-              <w:t xml:space="preserve">Region</w:t>
-            </w:r>
-          </w:p>
-        </w:tc>
-        <w:tc>
-          <w:tcPr>
-            <w:tcW w:type="dxa" w:w="1050"/>
-            <w:shd w:fill="EFE9F3" w:color="auto" w:val="clear"/>
-            <w:tcMar>
-              <w:top w:type="dxa" w:w="45"/>
-              <w:left w:type="dxa" w:w="90"/>
-              <w:bottom w:type="dxa" w:w="45"/>
-              <w:right w:type="dxa" w:w="90"/>
-            </w:tcMar>
-            <w:vAlign w:val="top"/>
-          </w:tcPr>
-          <w:p>
-            <w:pPr>
-              <w:spacing w:after="0" w:line="240"/>
-              <w:jc w:val="left"/>
-            </w:pPr>
-            <w:r>
-              <w:rPr>
-                <w:b/>
-                <w:bCs/>
-                <w:sz w:val="16"/>
-                <w:szCs w:val="16"/>
-              </w:rPr>
-              <w:t xml:space="preserve">Element</w:t>
-            </w:r>
-          </w:p>
-        </w:tc>
-        <w:tc>
-          <w:tcPr>
-            <w:tcW w:type="dxa" w:w="5956"/>
-            <w:shd w:fill="EFE9F3" w:color="auto" w:val="clear"/>
-            <w:tcMar>
-              <w:top w:type="dxa" w:w="45"/>
-              <w:left w:type="dxa" w:w="90"/>
-              <w:bottom w:type="dxa" w:w="45"/>
-              <w:right w:type="dxa" w:w="90"/>
-            </w:tcMar>
-            <w:vAlign w:val="top"/>
-          </w:tcPr>
-          <w:p>
-            <w:pPr>
-              <w:spacing w:after="0" w:line="240"/>
-              <w:jc w:val="left"/>
-            </w:pPr>
-            <w:r>
-              <w:rPr>
-                <w:b/>
-                <w:bCs/>
-                <w:sz w:val="16"/>
-                <w:szCs w:val="16"/>
-              </w:rPr>
-              <w:t xml:space="preserve">What waits there</w:t>
-            </w:r>
-          </w:p>
-        </w:tc>
-      </w:tr>
-      <w:tr>
-        <w:trPr>
-          <w:cantSplit/>
-        </w:trPr>
-        <w:tc>
-          <w:tcPr>
-            <w:tcW w:type="dxa" w:w="450"/>
-            <w:tcMar>
-              <w:top w:type="dxa" w:w="45"/>
-              <w:left w:type="dxa" w:w="90"/>
-              <w:bottom w:type="dxa" w:w="45"/>
-              <w:right w:type="dxa" w:w="90"/>
-            </w:tcMar>
-            <w:vAlign w:val="top"/>
-          </w:tcPr>
-          <w:p>
-            <w:pPr>
-              <w:spacing w:after="0" w:line="240"/>
-              <w:jc w:val="center"/>
-            </w:pPr>
-            <w:r>
-              <w:rPr>
-                <w:b w:val="false"/>
-                <w:bCs w:val="false"/>
-                <w:sz w:val="16"/>
-                <w:szCs w:val="16"/>
-              </w:rPr>
-              <w:t xml:space="preserve">1</w:t>
-            </w:r>
-          </w:p>
-        </w:tc>
-        <w:tc>
-          <w:tcPr>
-            <w:tcW w:type="dxa" w:w="1850"/>
-            <w:tcMar>
-              <w:top w:type="dxa" w:w="45"/>
-              <w:left w:type="dxa" w:w="90"/>
-              <w:bottom w:type="dxa" w:w="45"/>
-              <w:right w:type="dxa" w:w="90"/>
-            </w:tcMar>
-            <w:vAlign w:val="top"/>
-          </w:tcPr>
-          <w:p>
-            <w:pPr>
-              <w:spacing w:after="0" w:line="240"/>
-              <w:jc w:val="left"/>
-            </w:pPr>
-            <w:r>
-              <w:rPr>
-                <w:b w:val="false"/>
-                <w:bCs w:val="false"/>
-                <w:sz w:val="16"/>
-                <w:szCs w:val="16"/>
-              </w:rPr>
-              <w:t xml:space="preserve">Whispering Woods</w:t>
-            </w:r>
-          </w:p>
-        </w:tc>
-        <w:tc>
-          <w:tcPr>
-            <w:tcW w:type="dxa" w:w="1050"/>
-            <w:tcMar>
-              <w:top w:type="dxa" w:w="45"/>
-              <w:left w:type="dxa" w:w="90"/>
-              <w:bottom w:type="dxa" w:w="45"/>
-              <w:right w:type="dxa" w:w="90"/>
-            </w:tcMar>
-            <w:vAlign w:val="top"/>
-          </w:tcPr>
-          <w:p>
-            <w:pPr>
-              <w:spacing w:after="0" w:line="240"/>
-              <w:jc w:val="left"/>
-            </w:pPr>
-            <w:r>
-              <w:rPr>
-                <w:b w:val="false"/>
-                <w:bCs w:val="false"/>
-                <w:sz w:val="16"/>
-                <w:szCs w:val="16"/>
-              </w:rPr>
-              <w:t xml:space="preserve">Nature</w:t>
-            </w:r>
-          </w:p>
-        </w:tc>
-        <w:tc>
-          <w:tcPr>
-            <w:tcW w:type="dxa" w:w="5956"/>
-            <w:tcMar>
-              <w:top w:type="dxa" w:w="45"/>
-              <w:left w:type="dxa" w:w="90"/>
-              <w:bottom w:type="dxa" w:w="45"/>
-              <w:right w:type="dxa" w:w="90"/>
-            </w:tcMar>
-            <w:vAlign w:val="top"/>
-          </w:tcPr>
-          <w:p>
-            <w:pPr>
-              <w:spacing w:after="0" w:line="240"/>
-              <w:jc w:val="left"/>
-            </w:pPr>
-            <w:r>
-              <w:rPr>
-                <w:b w:val="false"/>
-                <w:bCs w:val="false"/>
-                <w:sz w:val="16"/>
-                <w:szCs w:val="16"/>
-              </w:rPr>
-              <w:t xml:space="preserve">Bark Treants, quick Thornlings and a Water-aligned wave of Mossbacks. The teaching road: the Elder Woodwose waits at its end once the road has been cleared.</w:t>
-            </w:r>
-          </w:p>
-        </w:tc>
-      </w:tr>
-      <w:tr>
-        <w:trPr>
-          <w:cantSplit/>
-        </w:trPr>
-        <w:tc>
-          <w:tcPr>
-            <w:tcW w:type="dxa" w:w="450"/>
-            <w:tcMar>
-              <w:top w:type="dxa" w:w="45"/>
-              <w:left w:type="dxa" w:w="90"/>
-              <w:bottom w:type="dxa" w:w="45"/>
-              <w:right w:type="dxa" w:w="90"/>
-            </w:tcMar>
-            <w:vAlign w:val="top"/>
-          </w:tcPr>
-          <w:p>
-            <w:pPr>
-              <w:spacing w:after="0" w:line="240"/>
-              <w:jc w:val="center"/>
-            </w:pPr>
-            <w:r>
-              <w:rPr>
-                <w:b w:val="false"/>
-                <w:bCs w:val="false"/>
-                <w:sz w:val="16"/>
-                <w:szCs w:val="16"/>
-              </w:rPr>
-              <w:t xml:space="preserve">2</w:t>
-            </w:r>
-          </w:p>
-        </w:tc>
-        <w:tc>
-          <w:tcPr>
-            <w:tcW w:type="dxa" w:w="1850"/>
-            <w:tcMar>
-              <w:top w:type="dxa" w:w="45"/>
-              <w:left w:type="dxa" w:w="90"/>
-              <w:bottom w:type="dxa" w:w="45"/>
-              <w:right w:type="dxa" w:w="90"/>
-            </w:tcMar>
-            <w:vAlign w:val="top"/>
-          </w:tcPr>
-          <w:p>
-            <w:pPr>
-              <w:spacing w:after="0" w:line="240"/>
-              <w:jc w:val="left"/>
-            </w:pPr>
-            <w:r>
-              <w:rPr>
-                <w:b w:val="false"/>
-                <w:bCs w:val="false"/>
-                <w:sz w:val="16"/>
-                <w:szCs w:val="16"/>
-              </w:rPr>
-              <w:t xml:space="preserve">Cinder Peaks</w:t>
-            </w:r>
-          </w:p>
-        </w:tc>
-        <w:tc>
-          <w:tcPr>
-            <w:tcW w:type="dxa" w:w="1050"/>
-            <w:tcMar>
-              <w:top w:type="dxa" w:w="45"/>
-              <w:left w:type="dxa" w:w="90"/>
-              <w:bottom w:type="dxa" w:w="45"/>
-              <w:right w:type="dxa" w:w="90"/>
-            </w:tcMar>
-            <w:vAlign w:val="top"/>
-          </w:tcPr>
-          <w:p>
-            <w:pPr>
-              <w:spacing w:after="0" w:line="240"/>
-              <w:jc w:val="left"/>
-            </w:pPr>
-            <w:r>
-              <w:rPr>
-                <w:b w:val="false"/>
-                <w:bCs w:val="false"/>
-                <w:sz w:val="16"/>
-                <w:szCs w:val="16"/>
-              </w:rPr>
-              <w:t xml:space="preserve">Fire</w:t>
-            </w:r>
-          </w:p>
-        </w:tc>
-        <w:tc>
-          <w:tcPr>
-            <w:tcW w:type="dxa" w:w="5956"/>
-            <w:tcMar>
-              <w:top w:type="dxa" w:w="45"/>
-              <w:left w:type="dxa" w:w="90"/>
-              <w:bottom w:type="dxa" w:w="45"/>
-              <w:right w:type="dxa" w:w="90"/>
-            </w:tcMar>
-            <w:vAlign w:val="top"/>
-          </w:tcPr>
-          <w:p>
-            <w:pPr>
-              <w:spacing w:after="0" w:line="240"/>
-              <w:jc w:val="left"/>
-            </w:pPr>
-            <w:r>
-              <w:rPr>
-                <w:b w:val="false"/>
-                <w:bCs w:val="false"/>
-                <w:sz w:val="16"/>
-                <w:szCs w:val="16"/>
-              </w:rPr>
-              <w:t xml:space="preserve">Emberling packs and Cinder Hounds, the fastest creatures in the forest.</w:t>
-            </w:r>
-          </w:p>
-        </w:tc>
-      </w:tr>
-      <w:tr>
-        <w:trPr>
-          <w:cantSplit/>
-        </w:trPr>
-        <w:tc>
-          <w:tcPr>
-            <w:tcW w:type="dxa" w:w="450"/>
-            <w:tcMar>
-              <w:top w:type="dxa" w:w="45"/>
-              <w:left w:type="dxa" w:w="90"/>
-              <w:bottom w:type="dxa" w:w="45"/>
-              <w:right w:type="dxa" w:w="90"/>
-            </w:tcMar>
-            <w:vAlign w:val="top"/>
-          </w:tcPr>
-          <w:p>
-            <w:pPr>
-              <w:spacing w:after="0" w:line="240"/>
-              <w:jc w:val="center"/>
-            </w:pPr>
-            <w:r>
-              <w:rPr>
-                <w:b w:val="false"/>
-                <w:bCs w:val="false"/>
-                <w:sz w:val="16"/>
-                <w:szCs w:val="16"/>
-              </w:rPr>
-              <w:t xml:space="preserve">3</w:t>
-            </w:r>
-          </w:p>
-        </w:tc>
-        <w:tc>
-          <w:tcPr>
-            <w:tcW w:type="dxa" w:w="1850"/>
-            <w:tcMar>
-              <w:top w:type="dxa" w:w="45"/>
-              <w:left w:type="dxa" w:w="90"/>
-              <w:bottom w:type="dxa" w:w="45"/>
-              <w:right w:type="dxa" w:w="90"/>
-            </w:tcMar>
-            <w:vAlign w:val="top"/>
-          </w:tcPr>
-          <w:p>
-            <w:pPr>
-              <w:spacing w:after="0" w:line="240"/>
-              <w:jc w:val="left"/>
-            </w:pPr>
-            <w:r>
-              <w:rPr>
-                <w:b w:val="false"/>
-                <w:bCs w:val="false"/>
-                <w:sz w:val="16"/>
-                <w:szCs w:val="16"/>
-              </w:rPr>
-              <w:t xml:space="preserve">Frostbite Caverns</w:t>
-            </w:r>
-          </w:p>
-        </w:tc>
-        <w:tc>
-          <w:tcPr>
-            <w:tcW w:type="dxa" w:w="1050"/>
-            <w:tcMar>
-              <w:top w:type="dxa" w:w="45"/>
-              <w:left w:type="dxa" w:w="90"/>
-              <w:bottom w:type="dxa" w:w="45"/>
-              <w:right w:type="dxa" w:w="90"/>
-            </w:tcMar>
-            <w:vAlign w:val="top"/>
-          </w:tcPr>
-          <w:p>
-            <w:pPr>
-              <w:spacing w:after="0" w:line="240"/>
-              <w:jc w:val="left"/>
-            </w:pPr>
-            <w:r>
-              <w:rPr>
-                <w:b w:val="false"/>
-                <w:bCs w:val="false"/>
-                <w:sz w:val="16"/>
-                <w:szCs w:val="16"/>
-              </w:rPr>
-              <w:t xml:space="preserve">Water</w:t>
-            </w:r>
-          </w:p>
-        </w:tc>
-        <w:tc>
-          <w:tcPr>
-            <w:tcW w:type="dxa" w:w="5956"/>
-            <w:tcMar>
-              <w:top w:type="dxa" w:w="45"/>
-              <w:left w:type="dxa" w:w="90"/>
-              <w:bottom w:type="dxa" w:w="45"/>
-              <w:right w:type="dxa" w:w="90"/>
-            </w:tcMar>
-            <w:vAlign w:val="top"/>
-          </w:tcPr>
-          <w:p>
-            <w:pPr>
-              <w:spacing w:after="0" w:line="240"/>
-              <w:jc w:val="left"/>
-            </w:pPr>
-            <w:r>
-              <w:rPr>
-                <w:b w:val="false"/>
-                <w:bCs w:val="false"/>
-                <w:sz w:val="16"/>
-                <w:szCs w:val="16"/>
-              </w:rPr>
-              <w:t xml:space="preserve">Swarming Frostkin and slow, heavy Rimebeasts.</w:t>
-            </w:r>
-          </w:p>
-        </w:tc>
-      </w:tr>
-      <w:tr>
-        <w:trPr>
-          <w:cantSplit/>
-        </w:trPr>
-        <w:tc>
-          <w:tcPr>
-            <w:tcW w:type="dxa" w:w="450"/>
-            <w:tcMar>
-              <w:top w:type="dxa" w:w="45"/>
-              <w:left w:type="dxa" w:w="90"/>
-              <w:bottom w:type="dxa" w:w="45"/>
-              <w:right w:type="dxa" w:w="90"/>
-            </w:tcMar>
-            <w:vAlign w:val="top"/>
-          </w:tcPr>
-          <w:p>
-            <w:pPr>
-              <w:spacing w:after="0" w:line="240"/>
-              <w:jc w:val="center"/>
-            </w:pPr>
-            <w:r>
-              <w:rPr>
-                <w:b w:val="false"/>
-                <w:bCs w:val="false"/>
-                <w:sz w:val="16"/>
-                <w:szCs w:val="16"/>
-              </w:rPr>
-              <w:t xml:space="preserve">4</w:t>
-            </w:r>
-          </w:p>
-        </w:tc>
-        <w:tc>
-          <w:tcPr>
-            <w:tcW w:type="dxa" w:w="1850"/>
-            <w:tcMar>
-              <w:top w:type="dxa" w:w="45"/>
-              <w:left w:type="dxa" w:w="90"/>
-              <w:bottom w:type="dxa" w:w="45"/>
-              <w:right w:type="dxa" w:w="90"/>
-            </w:tcMar>
-            <w:vAlign w:val="top"/>
-          </w:tcPr>
-          <w:p>
-            <w:pPr>
-              <w:spacing w:after="0" w:line="240"/>
-              <w:jc w:val="left"/>
-            </w:pPr>
-            <w:r>
-              <w:rPr>
-                <w:b w:val="false"/>
-                <w:bCs w:val="false"/>
-                <w:sz w:val="16"/>
-                <w:szCs w:val="16"/>
-              </w:rPr>
-              <w:t xml:space="preserve">Venom Swamp</w:t>
-            </w:r>
-          </w:p>
-        </w:tc>
-        <w:tc>
-          <w:tcPr>
-            <w:tcW w:type="dxa" w:w="1050"/>
-            <w:tcMar>
-              <w:top w:type="dxa" w:w="45"/>
-              <w:left w:type="dxa" w:w="90"/>
-              <w:bottom w:type="dxa" w:w="45"/>
-              <w:right w:type="dxa" w:w="90"/>
-            </w:tcMar>
-            <w:vAlign w:val="top"/>
-          </w:tcPr>
-          <w:p>
-            <w:pPr>
-              <w:spacing w:after="0" w:line="240"/>
-              <w:jc w:val="left"/>
-            </w:pPr>
-            <w:r>
-              <w:rPr>
-                <w:b w:val="false"/>
-                <w:bCs w:val="false"/>
-                <w:sz w:val="16"/>
-                <w:szCs w:val="16"/>
-              </w:rPr>
-              <w:t xml:space="preserve">Poison</w:t>
-            </w:r>
-          </w:p>
-        </w:tc>
-        <w:tc>
-          <w:tcPr>
-            <w:tcW w:type="dxa" w:w="5956"/>
-            <w:tcMar>
-              <w:top w:type="dxa" w:w="45"/>
-              <w:left w:type="dxa" w:w="90"/>
-              <w:bottom w:type="dxa" w:w="45"/>
-              <w:right w:type="dxa" w:w="90"/>
-            </w:tcMar>
-            <w:vAlign w:val="top"/>
-          </w:tcPr>
-          <w:p>
-            <w:pPr>
-              <w:spacing w:after="0" w:line="240"/>
-              <w:jc w:val="left"/>
-            </w:pPr>
-            <w:r>
-              <w:rPr>
-                <w:b w:val="false"/>
-                <w:bCs w:val="false"/>
-                <w:sz w:val="16"/>
-                <w:szCs w:val="16"/>
-              </w:rPr>
-              <w:t xml:space="preserve">Snapping Miremaws and hulking Bog Treants.</w:t>
-            </w:r>
-          </w:p>
-        </w:tc>
-      </w:tr>
-      <w:tr>
-        <w:trPr>
-          <w:cantSplit/>
-        </w:trPr>
-        <w:tc>
-          <w:tcPr>
-            <w:tcW w:type="dxa" w:w="450"/>
-            <w:tcMar>
-              <w:top w:type="dxa" w:w="45"/>
-              <w:left w:type="dxa" w:w="90"/>
-              <w:bottom w:type="dxa" w:w="45"/>
-              <w:right w:type="dxa" w:w="90"/>
-            </w:tcMar>
-            <w:vAlign w:val="top"/>
-          </w:tcPr>
-          <w:p>
-            <w:pPr>
-              <w:spacing w:after="0" w:line="240"/>
-              <w:jc w:val="center"/>
-            </w:pPr>
-            <w:r>
-              <w:rPr>
-                <w:b w:val="false"/>
-                <w:bCs w:val="false"/>
-                <w:sz w:val="16"/>
-                <w:szCs w:val="16"/>
-              </w:rPr>
-              <w:t xml:space="preserve">5</w:t>
-            </w:r>
-          </w:p>
-        </w:tc>
-        <w:tc>
-          <w:tcPr>
-            <w:tcW w:type="dxa" w:w="1850"/>
-            <w:tcMar>
-              <w:top w:type="dxa" w:w="45"/>
-              <w:left w:type="dxa" w:w="90"/>
-              <w:bottom w:type="dxa" w:w="45"/>
-              <w:right w:type="dxa" w:w="90"/>
-            </w:tcMar>
-            <w:vAlign w:val="top"/>
-          </w:tcPr>
-          <w:p>
-            <w:pPr>
-              <w:spacing w:after="0" w:line="240"/>
-              <w:jc w:val="left"/>
-            </w:pPr>
-            <w:r>
-              <w:rPr>
-                <w:b w:val="false"/>
-                <w:bCs w:val="false"/>
-                <w:sz w:val="16"/>
-                <w:szCs w:val="16"/>
-              </w:rPr>
-              <w:t xml:space="preserve">The Coven’s Peak</w:t>
-            </w:r>
-          </w:p>
-        </w:tc>
-        <w:tc>
-          <w:tcPr>
-            <w:tcW w:type="dxa" w:w="1050"/>
-            <w:tcMar>
-              <w:top w:type="dxa" w:w="45"/>
-              <w:left w:type="dxa" w:w="90"/>
-              <w:bottom w:type="dxa" w:w="45"/>
-              <w:right w:type="dxa" w:w="90"/>
-            </w:tcMar>
-            <w:vAlign w:val="top"/>
-          </w:tcPr>
-          <w:p>
-            <w:pPr>
-              <w:spacing w:after="0" w:line="240"/>
-              <w:jc w:val="left"/>
-            </w:pPr>
-            <w:r>
-              <w:rPr>
-                <w:b w:val="false"/>
-                <w:bCs w:val="false"/>
-                <w:sz w:val="16"/>
-                <w:szCs w:val="16"/>
-              </w:rPr>
-              <w:t xml:space="preserve">Arcane</w:t>
-            </w:r>
-          </w:p>
-        </w:tc>
-        <w:tc>
-          <w:tcPr>
-            <w:tcW w:type="dxa" w:w="5956"/>
-            <w:tcMar>
-              <w:top w:type="dxa" w:w="45"/>
-              <w:left w:type="dxa" w:w="90"/>
-              <w:bottom w:type="dxa" w:w="45"/>
-              <w:right w:type="dxa" w:w="90"/>
-            </w:tcMar>
-            <w:vAlign w:val="top"/>
-          </w:tcPr>
-          <w:p>
-            <w:pPr>
-              <w:spacing w:after="0" w:line="240"/>
-              <w:jc w:val="left"/>
-            </w:pPr>
-            <w:r>
-              <w:rPr>
-                <w:b w:val="false"/>
-                <w:bCs w:val="false"/>
-                <w:sz w:val="16"/>
-                <w:szCs w:val="16"/>
-              </w:rPr>
-              <w:t xml:space="preserve">Coven Acolytes, Warded Effigies and the Coven Matriarch herself: the end of the story.</w:t>
-            </w:r>
-          </w:p>
-        </w:tc>
-      </w:tr>
-    </w:tbl>
-    <w:p>
-      <w:pPr>
-        <w:spacing w:after="70"/>
-      </w:pPr>
+        <w:t xml:space="preserve">Bought the night before: the iron pot turns copper under a clockwork paddle, the kiln is clad in copper with a heat dial, and herbs hang over a brass mortar.</w:t>
+      </w:r>
     </w:p>
     <w:p>
       <w:pPr>
+        <w:pStyle w:val="Heading2"/>
         <w:keepNext/>
-        <w:spacing w:after="60" w:before="0" w:line="264"/>
-        <w:jc w:val="both"/>
-      </w:pPr>
-      <w:r>
-        <w:t xml:space="preserve">Power grows in three ways, and every one of them is gated so the late game stays hard:</w:t>
+        <w:spacing w:after="70" w:before="150"/>
+      </w:pPr>
+      <w:r>
+        <w:t xml:space="preserve">Replayability</w:t>
       </w:r>
     </w:p>
     <w:p>
@@ -3419,24 +3687,7 @@
         <w:jc w:val="left"/>
       </w:pPr>
       <w:r>
-        <w:rPr>
-          <w:b/>
-          <w:bCs/>
-        </w:rPr>
-        <w:t xml:space="preserve">Better brewing.</w:t>
-      </w:r>
-      <w:r>
-        <w:t xml:space="preserve"> The recipe book grows as regions fall — quick two-step brews, balanced classics and five-step </w:t>
-      </w:r>
-      <w:r>
-        <w:rPr>
-          <w:i/>
-          <w:iCs/>
-        </w:rPr>
-        <w:t xml:space="preserve">deep</w:t>
-      </w:r>
-      <w:r>
-        <w:t xml:space="preserve"> recipes that hit far harder but eat the morning clock.</w:t>
+        <w:t xml:space="preserve">Any cleared region can be replayed for half the fee but full loot — the way to farm gold and rare ingredients, and a safety net so the player can never get stuck.</w:t>
       </w:r>
     </w:p>
     <w:p>
@@ -3450,45 +3701,7 @@
         <w:jc w:val="left"/>
       </w:pPr>
       <w:r>
-        <w:rPr>
-          <w:b/>
-          <w:bCs/>
-        </w:rPr>
-        <w:t xml:space="preserve">Better heroes.</w:t>
-      </w:r>
-      <w:r>
-        <w:t xml:space="preserve"> Hire a roster of up to five (150, 240, 330, 420 gold) and level each from 1 to 5 (45, 80, 140, 240 gold). Levels are deliberately modest: matching the right hero to the right flask matters more than grinding.</w:t>
-      </w:r>
-    </w:p>
-    <w:p>
-      <w:pPr>
-        <w:pStyle w:val="ListParagraph"/>
-        <w:numPr>
-          <w:ilvl w:val="0"/>
-          <w:numId w:val="2"/>
-        </w:numPr>
-        <w:spacing w:after="110" w:line="252"/>
-        <w:jc w:val="left"/>
-      </w:pPr>
-      <w:r>
-        <w:rPr>
-          <w:b/>
-          <w:bCs/>
-        </w:rPr>
-        <w:t xml:space="preserve">A bigger party.</w:t>
-      </w:r>
-      <w:r>
-        <w:t xml:space="preserve"> Only one hero goes out at first. A second slot unlocks after Cinder Peaks and a third after Venom Swamp — and every extra hero needs their own brew in the same morning.</w:t>
-      </w:r>
-    </w:p>
-    <w:p>
-      <w:pPr>
-        <w:pStyle w:val="Heading2"/>
-        <w:keepNext/>
-        <w:spacing w:after="70" w:before="150"/>
-      </w:pPr>
-      <w:r>
-        <w:t xml:space="preserve">Replayability</w:t>
+        <w:t xml:space="preserve">Every region is graded out of three stars, so there is always a cleaner run to chase.</w:t>
       </w:r>
     </w:p>
     <w:p>
@@ -3502,35 +3715,7 @@
         <w:jc w:val="left"/>
       </w:pPr>
       <w:r>
-        <w:t xml:space="preserve">Any cleared region can be replayed for half the fee but full loot — the way to farm gold and rare ingredients, and a safety net so the player can never get stuck.</w:t>
-      </w:r>
-    </w:p>
-    <w:p>
-      <w:pPr>
-        <w:pStyle w:val="ListParagraph"/>
-        <w:numPr>
-          <w:ilvl w:val="0"/>
-          <w:numId w:val="2"/>
-        </w:numPr>
-        <w:spacing w:after="55" w:line="252"/>
-        <w:jc w:val="left"/>
-      </w:pPr>
-      <w:r>
-        <w:t xml:space="preserve">Every region is graded out of three stars, so there is always a cleaner run to chase.</w:t>
-      </w:r>
-    </w:p>
-    <w:p>
-      <w:pPr>
-        <w:pStyle w:val="ListParagraph"/>
-        <w:numPr>
-          <w:ilvl w:val="0"/>
-          <w:numId w:val="2"/>
-        </w:numPr>
-        <w:spacing w:after="55" w:line="252"/>
-        <w:jc w:val="left"/>
-      </w:pPr>
-      <w:r>
-        <w:t xml:space="preserve">Customers rotate daily, each with their own favourite element, fee and standards, and the three jobs on the board always pull in different directions.</w:t>
+        <w:t xml:space="preserve">Each hero brings their own element and standards to the counter, visiting patrons back the Guild’s commissions, and the three jobs on the board always pull in different directions.</w:t>
       </w:r>
     </w:p>
     <w:p>
@@ -3740,7 +3925,7 @@
               <w:t xml:space="preserve">The Counter</w:t>
             </w:r>
             <w:r>
-              <w:t xml:space="preserve"> — the day’s customer, three jobs on the board and a scouting report of every wave on today’s road.</w:t>
+              <w:t xml:space="preserve"> — the heroes going out, one after another, three jobs on the board and a scouting report of every wave on today’s road.</w:t>
             </w:r>
           </w:p>
           <w:p>
@@ -3758,10 +3943,10 @@
                 <w:b/>
                 <w:bCs/>
               </w:rPr>
-              <w:t xml:space="preserve">The Prep bench</w:t>
-            </w:r>
-            <w:r>
-              <w:t xml:space="preserve"> — leaves, roots and caps, each with an element, a potency and sometimes a wilt; the mortar and pestle.</w:t>
+              <w:t xml:space="preserve">The Malting bench</w:t>
+            </w:r>
+            <w:r>
+              <w:t xml:space="preserve"> — a steeping jar and a brick kiln: the grain is soaked, sprouted and dried before anything else.</w:t>
             </w:r>
           </w:p>
           <w:p>
@@ -3779,10 +3964,31 @@
                 <w:b/>
                 <w:bCs/>
               </w:rPr>
+              <w:t xml:space="preserve">The Prep bench</w:t>
+            </w:r>
+            <w:r>
+              <w:t xml:space="preserve"> — leaves, roots and caps, each with an element, a potency and sometimes a wilt; the mortar and pestle.</w:t>
+            </w:r>
+          </w:p>
+          <w:p>
+            <w:pPr>
+              <w:pStyle w:val="ListParagraph"/>
+              <w:numPr>
+                <w:ilvl w:val="0"/>
+                <w:numId w:val="2"/>
+              </w:numPr>
+              <w:spacing w:after="55" w:line="252"/>
+              <w:jc w:val="left"/>
+            </w:pPr>
+            <w:r>
+              <w:rPr>
+                <w:b/>
+                <w:bCs/>
+              </w:rPr>
               <w:t xml:space="preserve">The Cauldron</w:t>
             </w:r>
             <w:r>
-              <w:t xml:space="preserve"> — the heart of the room, stirred by hand.</w:t>
+              <w:t xml:space="preserve"> — the heart of the room, stirred by hand, or by a clockwork paddle once one is bought.</w:t>
             </w:r>
           </w:p>
           <w:p>
@@ -4119,7 +4325,7 @@
         <w:t xml:space="preserve">morning is a rush</w:t>
       </w:r>
       <w:r>
-        <w:t xml:space="preserve">: the clock is draining, the stir band is drifting, a customer is waiting and the player’s hands are full. The </w:t>
+        <w:t xml:space="preserve">: the clock is draining, one hero’s grain is drying in the kiln while the next one’s leaves wait in the mortar, the stir band is drifting and the player’s hands are full. The </w:t>
       </w:r>
       <w:r>
         <w:rPr>
@@ -4264,7 +4470,7 @@
         <w:t xml:space="preserve">Rising stakes.</w:t>
       </w:r>
       <w:r>
-        <w:t xml:space="preserve"> Each region is harder than the last, the party grows, the mornings get more crowded, and the clues pile up — all building to the Coven’s Peak and the mask.</w:t>
+        <w:t xml:space="preserve"> Each region is harder than the last — from the third road on, nobody walks it alone and unequipped — the party grows, the mornings get more crowded, and the clues pile up, all building to the Coven’s Peak and the mask.</w:t>
       </w:r>
     </w:p>
     <w:p>
@@ -4945,9 +5151,9 @@
       <w:r>
         <w:drawing>
           <wp:inline distT="0" distB="0" distL="0" distR="0">
-            <wp:extent cx="5334000" cy="1038225"/>
+            <wp:extent cx="5715000" cy="1000125"/>
             <wp:effectExtent t="0" r="0" b="0" l="0"/>
-            <wp:docPr id="1" name="stations.png" descr="The four stations: Counter, Prep, Cauldron, Bottling" title="The four stations: Counter, Prep, Cauldron, Bottling"/>
+            <wp:docPr id="1" name="stations.png" descr="The five benches: Counter, Malting, Prep, Cauldron, Bottling" title="The five benches: Counter, Malting, Prep, Cauldron, Bottling"/>
             <wp:cNvGraphicFramePr>
               <a:graphicFrameLocks xmlns:a="http://schemas.openxmlformats.org/drawingml/2006/main" noChangeAspect="1"/>
             </wp:cNvGraphicFramePr>
@@ -4970,7 +5176,7 @@
                   <pic:spPr bwMode="auto">
                     <a:xfrm>
                       <a:off x="0" y="0"/>
-                      <a:ext cx="5334000" cy="1038225"/>
+                      <a:ext cx="5715000" cy="1000125"/>
                     </a:xfrm>
                     <a:prstGeom prst="rect">
                       <a:avLst/>
@@ -5008,7 +5214,7 @@
           <w:b/>
           <w:bCs/>
         </w:rPr>
-        <w:t xml:space="preserve">Four physics benches.</w:t>
+        <w:t xml:space="preserve">Five physics benches, one flask per hero.</w:t>
       </w:r>
       <w:r>
         <w:t xml:space="preserve"> </w:t>
@@ -5021,7 +5227,17 @@
         <w:t xml:space="preserve">Counter:</w:t>
       </w:r>
       <w:r>
-        <w:t xml:space="preserve"> pick one of three jobs — the safe standing order, a guild commission that pays far more but refuses a sloppy flask, or the customer’s favourite, often the wrong element for the road. </w:t>
+        <w:t xml:space="preserve"> each hero going out picks one of three jobs — the safe standing order, a guild commission that pays far more but refuses a sloppy flask, or their own element, often the wrong one for the road. </w:t>
+      </w:r>
+      <w:r>
+        <w:rPr>
+          <w:i/>
+          <w:iCs/>
+        </w:rPr>
+        <w:t xml:space="preserve">Malting:</w:t>
+      </w:r>
+      <w:r>
+        <w:t xml:space="preserve"> pour grain into the steep, where sound grain sinks and husks float to be skimmed, turn the sprouting bed, then dry it in the kiln, holding the heat in its band — good malt makes the herbs dissolve faster. </w:t>
       </w:r>
       <w:r>
         <w:rPr>
@@ -5031,7 +5247,7 @@
         <w:t xml:space="preserve">Prep:</w:t>
       </w:r>
       <w:r>
-        <w:t xml:space="preserve"> toss the recipe’s leaves into the mortar (they fly on real arcs), then lift the pestle and let it drop: its speed at impact is the strike’s grade, and too hard throws a leaf out. </w:t>
+        <w:t xml:space="preserve"> toss the leaves into the mortar (they fly on real arcs), then press on the bowl to lift the pestle and let it drop: its speed at impact is the strike’s grade. </w:t>
       </w:r>
       <w:r>
         <w:rPr>
@@ -5041,7 +5257,7 @@
         <w:t xml:space="preserve">Cauldron:</w:t>
       </w:r>
       <w:r>
-        <w:t xml:space="preserve"> stir the spoon round the pot the way the recipe turns, and hold that stir inside a band that drifts: the herbs ride the vortex and dissolve, too slow and the brew catches and burns on the bottom, too fast and it slops over the rim, herbs and all. </w:t>
+        <w:t xml:space="preserve"> stir the way the recipe turns and hold the stir inside a drifting band — too slow and the brew catches and burns, too fast and it slops over the rim. </w:t>
       </w:r>
       <w:r>
         <w:rPr>
@@ -5051,7 +5267,7 @@
         <w:t xml:space="preserve">Bottling:</w:t>
       </w:r>
       <w:r>
-        <w:t xml:space="preserve"> tip the ladle on its hinge to pour real droplets to the line, press the cork home on the beat, and label it right.</w:t>
+        <w:t xml:space="preserve"> tip the ladle to pour real droplets to the line, cork it on the beat and label it. Each bench takes the next flask waiting for it, so a party’s flasks are brewed side by side.</w:t>
       </w:r>
     </w:p>
     <w:p>
@@ -5968,13 +6184,13 @@
     </w:p>
     <w:p>
       <w:pPr>
-        <w:spacing w:after="30" w:before="0"/>
+        <w:spacing w:after="20" w:before="0"/>
         <w:jc w:val="center"/>
       </w:pPr>
       <w:r>
         <w:drawing>
           <wp:inline distT="0" distB="0" distL="0" distR="0">
-            <wp:extent cx="4476750" cy="1790700"/>
+            <wp:extent cx="4000500" cy="1600200"/>
             <wp:effectExtent t="0" r="0" b="0" l="0"/>
             <wp:docPr id="1" name="wheel.png" descr="Elemental effectiveness wheel" title="Elemental effectiveness wheel"/>
             <wp:cNvGraphicFramePr>
@@ -5999,7 +6215,7 @@
                   <pic:spPr bwMode="auto">
                     <a:xfrm>
                       <a:off x="0" y="0"/>
-                      <a:ext cx="4476750" cy="1790700"/>
+                      <a:ext cx="4000500" cy="1600200"/>
                     </a:xfrm>
                     <a:prstGeom prst="rect">
                       <a:avLst/>
@@ -6143,7 +6359,7 @@
         <w:jc w:val="both"/>
       </w:pPr>
       <w:r>
-        <w:t xml:space="preserve">The cursed forest is thick with elemental creatures, and every region’s monsters share its element — which is exactly why the right flask matters. They arrive in waves the Counter scouts in advance, so the player always knows what is coming and has to decide what to brew for it. Most creatures walk straight at the heroes and strike on contact, and most regions mix in a wave of a different element that punishes a single-element plan — one flask rarely covers a whole road.</w:t>
+        <w:t xml:space="preserve">The cursed forest is thick with elemental creatures, and every region’s monsters share its element — which is exactly why the right flask matters. They arrive in waves the Counter scouts in advance, so the player always knows what is coming and has to decide what to brew for it. Most creatures walk straight at the heroes and bite on contact, harder the further up the road, and most regions mix in a wave of a different element that punishes a single-element plan — a party carrying more than one kind of flask does better.</w:t>
       </w:r>
     </w:p>
     <w:tbl>
@@ -6254,7 +6470,7 @@
                 <w:sz w:val="15"/>
                 <w:szCs w:val="15"/>
               </w:rPr>
-              <w:t xml:space="preserve">Bark Treant · Thornling · Mossback · Bog Treant</w:t>
+              <w:t xml:space="preserve">Bark Treant · Thornling · Mossback · Bog Treant · Bog Brute</w:t>
             </w:r>
           </w:p>
           <w:p>
@@ -6269,7 +6485,7 @@
                 <w:sz w:val="15"/>
                 <w:szCs w:val="15"/>
               </w:rPr>
-              <w:t xml:space="preserve">Nature / Water</w:t>
+              <w:t xml:space="preserve">Nature / Water / Poison</w:t>
             </w:r>
           </w:p>
           <w:p>
@@ -6284,7 +6500,7 @@
                 <w:sz w:val="15"/>
                 <w:szCs w:val="15"/>
               </w:rPr>
-              <w:t xml:space="preserve">34–70 HP</w:t>
+              <w:t xml:space="preserve">34–630 HP</w:t>
             </w:r>
           </w:p>
           <w:p>
@@ -6299,7 +6515,7 @@
                 <w:sz w:val="15"/>
                 <w:szCs w:val="15"/>
               </w:rPr>
-              <w:t xml:space="preserve">Rooted and patient — except the Thornlings, which close the gap fast.</w:t>
+              <w:t xml:space="preserve">Rooted and patient — except the Thornlings; the Brutes are the heaviest things in the swamp.</w:t>
             </w:r>
           </w:p>
         </w:tc>
@@ -6518,7 +6734,7 @@
                 <w:sz w:val="15"/>
                 <w:szCs w:val="15"/>
               </w:rPr>
-              <w:t xml:space="preserve">Frostkin · Rimebeast</w:t>
+              <w:t xml:space="preserve">Frostkin · Rimebeast · Rime Wraith · Frost Troll</w:t>
             </w:r>
           </w:p>
           <w:p>
@@ -6533,7 +6749,7 @@
                 <w:sz w:val="15"/>
                 <w:szCs w:val="15"/>
               </w:rPr>
-              <w:t xml:space="preserve">Water</w:t>
+              <w:t xml:space="preserve">Water / Arcane</w:t>
             </w:r>
           </w:p>
           <w:p>
@@ -6548,7 +6764,7 @@
                 <w:sz w:val="15"/>
                 <w:szCs w:val="15"/>
               </w:rPr>
-              <w:t xml:space="preserve">50–80 HP</w:t>
+              <w:t xml:space="preserve">105–390 HP</w:t>
             </w:r>
           </w:p>
           <w:p>
@@ -6563,7 +6779,7 @@
                 <w:sz w:val="15"/>
                 <w:szCs w:val="15"/>
               </w:rPr>
-              <w:t xml:space="preserve">Water swarms, and Rimebeasts that soak up punishment.</w:t>
+              <w:t xml:space="preserve">Water swarms, Arcane wraiths, and trolls that soak up punishment.</w:t>
             </w:r>
           </w:p>
         </w:tc>
@@ -6650,7 +6866,7 @@
                 <w:sz w:val="15"/>
                 <w:szCs w:val="15"/>
               </w:rPr>
-              <w:t xml:space="preserve">Miremaw</w:t>
+              <w:t xml:space="preserve">Miremaw · Mire Leech · Blight Maw</w:t>
             </w:r>
           </w:p>
           <w:p>
@@ -6680,7 +6896,7 @@
                 <w:sz w:val="15"/>
                 <w:szCs w:val="15"/>
               </w:rPr>
-              <w:t xml:space="preserve">44 HP</w:t>
+              <w:t xml:space="preserve">120–195 HP</w:t>
             </w:r>
           </w:p>
           <w:p>
@@ -6695,7 +6911,7 @@
                 <w:sz w:val="15"/>
                 <w:szCs w:val="15"/>
               </w:rPr>
-              <w:t xml:space="preserve">Poison bog-mouths that hunt in fours.</w:t>
+              <w:t xml:space="preserve">Poison bog-mouths that hunt in packs; the leeches dart.</w:t>
             </w:r>
           </w:p>
         </w:tc>
@@ -6782,7 +6998,7 @@
                 <w:sz w:val="15"/>
                 <w:szCs w:val="15"/>
               </w:rPr>
-              <w:t xml:space="preserve">Coven Acolyte · Warded Effigy</w:t>
+              <w:t xml:space="preserve">Acolyte · Warded Effigy · Hexling · Warden</w:t>
             </w:r>
           </w:p>
           <w:p>
@@ -6812,7 +7028,7 @@
                 <w:sz w:val="15"/>
                 <w:szCs w:val="15"/>
               </w:rPr>
-              <w:t xml:space="preserve">55–90 HP</w:t>
+              <w:t xml:space="preserve">70–300 HP</w:t>
             </w:r>
           </w:p>
           <w:p>
@@ -6827,7 +7043,7 @@
                 <w:sz w:val="15"/>
                 <w:szCs w:val="15"/>
               </w:rPr>
-              <w:t xml:space="preserve">Arcane servants; the Effigies are the toughest regular foes.</w:t>
+              <w:t xml:space="preserve">Arcane servants; the Wardens are the toughest regular foes.</w:t>
             </w:r>
           </w:p>
         </w:tc>
@@ -6992,7 +7208,7 @@
               <w:t xml:space="preserve">telegraphed</w:t>
             </w:r>
             <w:r>
-              <w:t xml:space="preserve">: the guardian winds up in a pose that matches the attack and marks each spot it will hit on the ground, and heroes step out of the marks. Guardians are not scripted: they weigh their health, the damage just taken and how hard one element is pressing, and shift between four phases shown on screen. Their health is sized to the party they face.</w:t>
+              <w:t xml:space="preserve">: the guardian winds up in a pose that matches the attack and marks each spot it will hit on the ground, and heroes step out of the marks. Guardians are not scripted: they weigh their health, the damage just taken and how hard one element is pressing, and shift between four phases shown on screen. The Woodwose shrinks to suit a small party; the Matriarch hardly does — the Peak is no place for one hero.</w:t>
             </w:r>
           </w:p>
           <w:p>

</xml_diff>

<commit_message>
docs: the 10-pager's mechanics describe the hands-on benches and the ramp
</commit_message>
<xml_diff>
--- a/docs/Alchemists_Arsenal_10-pager.docx
+++ b/docs/Alchemists_Arsenal_10-pager.docx
@@ -997,7 +997,7 @@
         <w:jc w:val="left"/>
       </w:pPr>
       <w:r>
-        <w:t xml:space="preserve">Day one is a guided tutorial with a slower clock. After that you’re on your own, and the roads keep getting harder until the Coven’s Peak and the mask.</w:t>
+        <w:t xml:space="preserve">The first day only uses four benches and two-herb recipes, and the screen dims around the one thing to touch next. Each new road adds a step or two, and the same spotlight teaches each one the first time it turns up. By the third day everything is in play, and the roads keep getting harder until the Coven’s Peak and the mask.</w:t>
       </w:r>
     </w:p>
     <w:p>
@@ -1095,20 +1095,10 @@
           <w:b/>
           <w:bCs/>
         </w:rPr>
-        <w:t xml:space="preserve">Auto-battle</w:t>
-      </w:r>
-      <w:r>
-        <w:t xml:space="preserve">: heroes choose their own targets by scoring every throw they could make</w:t>
-      </w:r>
-    </w:p>
-    <w:p>
-      <w:pPr>
-        <w:pStyle w:val="Heading2"/>
-        <w:keepNext/>
-        <w:spacing w:after="140" w:before="240"/>
-      </w:pPr>
-      <w:r>
-        <w:t xml:space="preserve">Benches</w:t>
+        <w:t xml:space="preserve">A growing morning</w:t>
+      </w:r>
+      <w:r>
+        <w:t xml:space="preserve">: each new road adds a bench step, a longer recipe and another wave. Replaying a road keeps it exactly as hard as it was</w:t>
       </w:r>
     </w:p>
     <w:p>
@@ -1125,10 +1115,10 @@
           <w:b/>
           <w:bCs/>
         </w:rPr>
-        <w:t xml:space="preserve">Counter</w:t>
-      </w:r>
-      <w:r>
-        <w:t xml:space="preserve">: each hero picks one of three jobs: a safe one, a better-paid one that pays half for sloppy work, or their own element</w:t>
+        <w:t xml:space="preserve">Every bomb finished</w:t>
+      </w:r>
+      <w:r>
+        <w:t xml:space="preserve">: the heroes only leave once every bomb is sealed and labelled, or when the clock runs out</w:t>
       </w:r>
     </w:p>
     <w:p>
@@ -1145,10 +1135,20 @@
           <w:b/>
           <w:bCs/>
         </w:rPr>
-        <w:t xml:space="preserve">Malting</w:t>
-      </w:r>
-      <w:r>
-        <w:t xml:space="preserve">: soak the grain, skim off the husks that float, turn the sprouting bed and dry it in the kiln at the right heat</w:t>
+        <w:t xml:space="preserve">Auto-battle</w:t>
+      </w:r>
+      <w:r>
+        <w:t xml:space="preserve">: heroes choose their own targets by scoring every throw they could make</w:t>
+      </w:r>
+    </w:p>
+    <w:p>
+      <w:pPr>
+        <w:pStyle w:val="Heading2"/>
+        <w:keepNext/>
+        <w:spacing w:after="140" w:before="240"/>
+      </w:pPr>
+      <w:r>
+        <w:t xml:space="preserve">Benches</w:t>
       </w:r>
     </w:p>
     <w:p>
@@ -1165,10 +1165,10 @@
           <w:b/>
           <w:bCs/>
         </w:rPr>
-        <w:t xml:space="preserve">Prep</w:t>
-      </w:r>
-      <w:r>
-        <w:t xml:space="preserve">: toss the herbs into the mortar, then lift the pestle and let it drop. How fast it lands decides the strike</w:t>
+        <w:t xml:space="preserve">Counter</w:t>
+      </w:r>
+      <w:r>
+        <w:t xml:space="preserve">: the jobs hang on the board as paper tags: a safe one, a better-paid one that pays half for sloppy work, or the hero’s own element. Drag one onto the order book to take it</w:t>
       </w:r>
     </w:p>
     <w:p>
@@ -1185,10 +1185,10 @@
           <w:b/>
           <w:bCs/>
         </w:rPr>
-        <w:t xml:space="preserve">Cauldron</w:t>
-      </w:r>
-      <w:r>
-        <w:t xml:space="preserve">: stir the way the recipe turns and keep the speed inside a band. Too slow and it burns, too fast and it spills</w:t>
+        <w:t xml:space="preserve">Malting</w:t>
+      </w:r>
+      <w:r>
+        <w:t xml:space="preserve">: pour grain from the sack, carry the lid onto the jar, skim off the husks that float, turn the sprouting bed, then carry the malt to the kiln and feed the fire log by log</w:t>
       </w:r>
     </w:p>
     <w:p>
@@ -1205,10 +1205,50 @@
           <w:b/>
           <w:bCs/>
         </w:rPr>
+        <w:t xml:space="preserve">Prep</w:t>
+      </w:r>
+      <w:r>
+        <w:t xml:space="preserve">: toss the herbs into the mortar, then lift the pestle and let it drop. How fast it lands decides the strike</w:t>
+      </w:r>
+    </w:p>
+    <w:p>
+      <w:pPr>
+        <w:pStyle w:val="ListParagraph"/>
+        <w:numPr>
+          <w:ilvl w:val="0"/>
+          <w:numId w:val="2"/>
+        </w:numPr>
+        <w:spacing w:after="110" w:line="300"/>
+      </w:pPr>
+      <w:r>
+        <w:rPr>
+          <w:b/>
+          <w:bCs/>
+        </w:rPr>
+        <w:t xml:space="preserve">Cauldron</w:t>
+      </w:r>
+      <w:r>
+        <w:t xml:space="preserve">: stir the way the recipe turns and keep the speed inside a band. Too slow and it burns, too fast and it spills</w:t>
+      </w:r>
+    </w:p>
+    <w:p>
+      <w:pPr>
+        <w:pStyle w:val="ListParagraph"/>
+        <w:numPr>
+          <w:ilvl w:val="0"/>
+          <w:numId w:val="2"/>
+        </w:numPr>
+        <w:spacing w:after="110" w:line="300"/>
+      </w:pPr>
+      <w:r>
+        <w:rPr>
+          <w:b/>
+          <w:bCs/>
+        </w:rPr>
         <w:t xml:space="preserve">Bottling</w:t>
       </w:r>
       <w:r>
-        <w:t xml:space="preserve">: pour to the line, press the cork in on the beat and label the bomb</w:t>
+        <w:t xml:space="preserve">: drag the ladle down to pour to the line, carry the cork from its dish into the neck, and drag the right label onto the glass</w:t>
       </w:r>
     </w:p>
     <w:p>

</xml_diff>